<commit_message>
contratos-time: corrige docx ilegível, gênero, datas, fonte e 'entre entre'
- FIX crítico: registra todos os namespaces e reinjeta as declarações do root
  (mc:Ignorable) na serialização — resolve o aviso "conteúdo ilegível" do Word
- Gênero: formas duplas (o)/(a)/(or)/(r) viram {{brasileiro_a}}, {{administrador_a}},
  {{portador_a}}, {{inscrito_a}}, {{empresario_a}}, preenchidas por genero_map
  (feminino→a / masculino→o); intake pergunta o gênero
- Datas: remove pontos ("01.de agosto.de") e o bug {{Data}} duplicado -> padrão
  "{{DD}} de {{Mês}} de {{AAAA}}"
- Corrige "firmado entre entre" -> "firmado entre" no Anexo
- Fonte dos placeholders Segoe UI -> Times New Roman; rodapé de marca em Arial
  (universal / compatível com Google Docs)
- Templates full_time e freelancer reconstruídos dos originais; validado

Co-Authored-By: Claude Opus 4.8 <noreply@anthropic.com>
Claude-Session: https://claude.ai/code/session_01HrnpzzFeHRtBe1dRWCL3oW
</commit_message>
<xml_diff>
--- a/contratos-time/templates/freelancer.docx
+++ b/contratos-time/templates/freelancer.docx
@@ -1,8 +1,8 @@
 
 <file path=word/document.xml><?xml version="1.0" encoding="utf-8"?>
-<w:document xmlns:ns1="http://schemas.openxmlformats.org/markup-compatibility/2006" xmlns:ns2="http://schemas.microsoft.com/office/word/2010/wordml" xmlns:ns3="http://schemas.openxmlformats.org/officeDocument/2006/relationships" xmlns:w="http://schemas.openxmlformats.org/wordprocessingml/2006/main" ns1:Ignorable="w14 w15 w16se w16cid w16 w16cex w16sdtdh w16sdtfl w16du wp14">
+<w:document xmlns:wpc="http://schemas.microsoft.com/office/word/2010/wordprocessingCanvas" xmlns:cx="http://schemas.microsoft.com/office/drawing/2014/chartex" xmlns:cx1="http://schemas.microsoft.com/office/drawing/2015/9/8/chartex" xmlns:cx2="http://schemas.microsoft.com/office/drawing/2015/10/21/chartex" xmlns:cx3="http://schemas.microsoft.com/office/drawing/2016/5/9/chartex" xmlns:cx4="http://schemas.microsoft.com/office/drawing/2016/5/10/chartex" xmlns:cx5="http://schemas.microsoft.com/office/drawing/2016/5/11/chartex" xmlns:cx6="http://schemas.microsoft.com/office/drawing/2016/5/12/chartex" xmlns:cx7="http://schemas.microsoft.com/office/drawing/2016/5/13/chartex" xmlns:cx8="http://schemas.microsoft.com/office/drawing/2016/5/14/chartex" xmlns:aink="http://schemas.microsoft.com/office/drawing/2016/ink" xmlns:am3d="http://schemas.microsoft.com/office/drawing/2017/model3d" xmlns:o="urn:schemas-microsoft-com:office:office" xmlns:oel="http://schemas.microsoft.com/office/2019/extlst" xmlns:m="http://schemas.openxmlformats.org/officeDocument/2006/math" xmlns:v="urn:schemas-microsoft-com:vml" xmlns:wp14="http://schemas.microsoft.com/office/word/2010/wordprocessingDrawing" xmlns:wp="http://schemas.openxmlformats.org/drawingml/2006/wordprocessingDrawing" xmlns:w10="urn:schemas-microsoft-com:office:word" xmlns:w15="http://schemas.microsoft.com/office/word/2012/wordml" xmlns:w16cex="http://schemas.microsoft.com/office/word/2018/wordml/cex" xmlns:w16cid="http://schemas.microsoft.com/office/word/2016/wordml/cid" xmlns:w16="http://schemas.microsoft.com/office/word/2018/wordml" xmlns:w16du="http://schemas.microsoft.com/office/word/2023/wordml/word16du" xmlns:w16sdtdh="http://schemas.microsoft.com/office/word/2020/wordml/sdtdatahash" xmlns:w16sdtfl="http://schemas.microsoft.com/office/word/2024/wordml/sdtformatlock" xmlns:w16se="http://schemas.microsoft.com/office/word/2015/wordml/symex" xmlns:wpg="http://schemas.microsoft.com/office/word/2010/wordprocessingGroup" xmlns:wpi="http://schemas.microsoft.com/office/word/2010/wordprocessingInk" xmlns:wne="http://schemas.microsoft.com/office/word/2006/wordml" xmlns:wps="http://schemas.microsoft.com/office/word/2010/wordprocessingShape" xmlns:mc="http://schemas.openxmlformats.org/markup-compatibility/2006" xmlns:r="http://schemas.openxmlformats.org/officeDocument/2006/relationships" xmlns:w="http://schemas.openxmlformats.org/wordprocessingml/2006/main" xmlns:w14="http://schemas.microsoft.com/office/word/2010/wordml" mc:Ignorable="w14 w15 w16se w16cid w16 w16cex w16sdtdh w16sdtfl w16du wp14">
   <w:body>
-    <w:p ns2:paraId="28A2C18C" ns2:textId="77777777">
+    <w:p>
       <w:pPr>
         <w:pBdr>
           <w:bottom w:val="single" w:sz="12" w:space="1" w:color="000000"/>
@@ -16,7 +16,7 @@
         </w:rPr>
       </w:pPr>
     </w:p>
-    <w:p ns2:paraId="28A2C18D" ns2:textId="77777777">
+    <w:p>
       <w:pPr>
         <w:pBdr>
           <w:bottom w:val="single" w:sz="12" w:space="1" w:color="000000"/>
@@ -30,7 +30,7 @@
         </w:rPr>
       </w:pPr>
     </w:p>
-    <w:p ns2:paraId="28A2C18E" ns2:textId="77777777">
+    <w:p>
       <w:pPr>
         <w:spacing w:after="0" w:line="360" w:lineRule="auto"/>
         <w:jc w:val="center"/>
@@ -41,7 +41,7 @@
         </w:rPr>
       </w:pPr>
     </w:p>
-    <w:p ns2:paraId="28A2C18F" ns2:textId="77777777">
+    <w:p>
       <w:pPr>
         <w:spacing w:after="0" w:line="360" w:lineRule="auto"/>
         <w:ind w:right="-1"/>
@@ -67,7 +67,7 @@
         <w:t>Instrumento Particular de</w:t>
       </w:r>
     </w:p>
-    <w:p ns2:paraId="28A2C190" ns2:textId="77777777">
+    <w:p>
       <w:pPr>
         <w:spacing w:after="0" w:line="360" w:lineRule="auto"/>
         <w:ind w:right="-1"/>
@@ -91,7 +91,7 @@
         <w:t xml:space="preserve">Contrato de Prestação de Serviços </w:t>
       </w:r>
     </w:p>
-    <w:p ns2:paraId="28A2C191" ns2:textId="77777777">
+    <w:p>
       <w:pPr>
         <w:pBdr>
           <w:bottom w:val="single" w:sz="12" w:space="1" w:color="000000"/>
@@ -106,7 +106,7 @@
         </w:rPr>
       </w:pPr>
     </w:p>
-    <w:p ns2:paraId="28A2C192" ns2:textId="77777777">
+    <w:p>
       <w:pPr>
         <w:spacing w:after="0" w:line="360" w:lineRule="auto"/>
         <w:jc w:val="center"/>
@@ -117,7 +117,7 @@
         </w:rPr>
       </w:pPr>
     </w:p>
-    <w:p ns2:paraId="28A2C193" ns2:textId="77777777">
+    <w:p>
       <w:pPr>
         <w:spacing w:after="0" w:line="360" w:lineRule="auto"/>
         <w:jc w:val="center"/>
@@ -128,7 +128,7 @@
         </w:rPr>
       </w:pPr>
     </w:p>
-    <w:p ns2:paraId="28A2C194" ns2:textId="6436522F">
+    <w:p>
       <w:pPr>
         <w:spacing w:after="0" w:line="360" w:lineRule="auto"/>
         <w:jc w:val="both"/>
@@ -180,7 +180,7 @@
           <w:sz w:val="21"/>
           <w:szCs w:val="21"/>
         </w:rPr>
-        <w:t>, empresári</w:t>
+        <w:t>, {{empresario_a}} individual</w:t>
       </w:r>
       <w:r>
         <w:rPr>
@@ -189,7 +189,7 @@
           <w:sz w:val="21"/>
           <w:szCs w:val="21"/>
         </w:rPr>
-        <w:t>o</w:t>
+        <w:t/>
       </w:r>
       <w:r>
         <w:rPr>
@@ -198,7 +198,7 @@
           <w:sz w:val="21"/>
           <w:szCs w:val="21"/>
         </w:rPr>
-        <w:t xml:space="preserve"> individual, inscrit</w:t>
+        <w:t xml:space="preserve">, {{inscrito_a}} no CNPJ</w:t>
       </w:r>
       <w:r>
         <w:rPr>
@@ -207,7 +207,7 @@
           <w:sz w:val="21"/>
           <w:szCs w:val="21"/>
         </w:rPr>
-        <w:t>o</w:t>
+        <w:t/>
       </w:r>
       <w:r>
         <w:rPr>
@@ -216,7 +216,7 @@
           <w:sz w:val="21"/>
           <w:szCs w:val="21"/>
         </w:rPr>
-        <w:t xml:space="preserve"> no CNPJ sob n° {{CNPJ}}</w:t>
+        <w:t xml:space="preserve"> sob n° {{CNPJ}}</w:t>
       </w:r>
       <w:r>
         <w:rPr>
@@ -361,7 +361,7 @@
           <w:sz w:val="21"/>
           <w:szCs w:val="21"/>
         </w:rPr>
-        <w:t xml:space="preserve"> brasileiro(a), {{Estado Civil}}, portador do RG</w:t>
+        <w:t xml:space="preserve"> {{brasileiro_a}}, {{Estado Civil}}, {{portador_a}} do RG</w:t>
       </w:r>
       <w:r>
         <w:rPr>
@@ -415,7 +415,7 @@
           <w:sz w:val="21"/>
           <w:szCs w:val="21"/>
         </w:rPr>
-        <w:t>, inscrit</w:t>
+        <w:t>, {{inscrito_a}} no CPF</w:t>
       </w:r>
       <w:r>
         <w:rPr>
@@ -424,7 +424,7 @@
           <w:sz w:val="21"/>
           <w:szCs w:val="21"/>
         </w:rPr>
-        <w:t>o</w:t>
+        <w:t/>
       </w:r>
       <w:r>
         <w:rPr>
@@ -433,7 +433,7 @@
           <w:sz w:val="21"/>
           <w:szCs w:val="21"/>
         </w:rPr>
-        <w:t xml:space="preserve"> no CPF sob o nº {{Nº do CPF}}</w:t>
+        <w:t xml:space="preserve"> sob o nº {{Nº do CPF}}</w:t>
       </w:r>
       <w:r>
         <w:rPr>
@@ -474,7 +474,7 @@
         <w:t>”),</w:t>
       </w:r>
     </w:p>
-    <w:p ns2:paraId="28A2C195" ns2:textId="77777777">
+    <w:p>
       <w:pPr>
         <w:spacing w:after="0" w:line="360" w:lineRule="auto"/>
         <w:jc w:val="both"/>
@@ -486,7 +486,7 @@
         </w:rPr>
       </w:pPr>
     </w:p>
-    <w:p ns2:paraId="28A2C196" ns2:textId="77777777">
+    <w:p>
       <w:pPr>
         <w:spacing w:after="0" w:line="360" w:lineRule="auto"/>
         <w:jc w:val="both"/>
@@ -538,7 +538,7 @@
           <w:sz w:val="21"/>
           <w:szCs w:val="21"/>
         </w:rPr>
-        <w:t xml:space="preserve">, brasileiro, solteiro, portador da Cédula de Identidade RG n.º 35.692.455-5 SSP/SP, inscrito no CPF sob o n.º 366.599.668-62, domiciliado na Rua Augusto dos Anjos, nº 225, Apt. 16, Melville Empresarial I e II, Barueri/SP </w:t>
+        <w:t xml:space="preserve">, brasileiro, solteiro, portador da Cédula de Identidade RG n.º 35.692.455-5 SSP/SP, {{inscrito_a}} no CPF sob o n.º 366.599.668-62, domiciliado na Rua Augusto dos Anjos, nº 225, Apt. 16, Melville Empresarial I e II, Barueri/SP </w:t>
       </w:r>
       <w:bookmarkEnd w:id="0"/>
       <w:r>
@@ -571,7 +571,7 @@
         <w:t>”),</w:t>
       </w:r>
     </w:p>
-    <w:p ns2:paraId="28A2C197" ns2:textId="77777777">
+    <w:p>
       <w:pPr>
         <w:spacing w:after="0" w:line="360" w:lineRule="auto"/>
         <w:jc w:val="both"/>
@@ -583,7 +583,7 @@
         </w:rPr>
       </w:pPr>
     </w:p>
-    <w:p ns2:paraId="415156C3" ns2:textId="3BA4CB3C">
+    <w:p>
       <w:pPr>
         <w:spacing w:after="0" w:line="360" w:lineRule="auto"/>
         <w:jc w:val="both"/>
@@ -598,19 +598,19 @@
         <w:t>em conjunto, denominadas Partes e, separadamente, Parte, resolvem firmar o presente Instrumento Particular de Contrato de Prestação de Serviços (“Contrato / Instrumento”), que têm entre si justo e contratado, o que mutuamente outorgam, aceitam e assinam,</w:t>
       </w:r>
     </w:p>
-    <w:p ns2:paraId="24ED099E" ns2:textId="77777777">
-      <w:pPr>
-        <w:spacing w:after="0" w:line="360" w:lineRule="auto"/>
-        <w:jc w:val="both"/>
-      </w:pPr>
-    </w:p>
-    <w:p ns2:paraId="7BE31599" ns2:textId="77777777">
-      <w:pPr>
-        <w:spacing w:after="0" w:line="360" w:lineRule="auto"/>
-        <w:jc w:val="both"/>
-      </w:pPr>
-    </w:p>
-    <w:p ns2:paraId="28A2C19A" ns2:textId="77777777">
+    <w:p>
+      <w:pPr>
+        <w:spacing w:after="0" w:line="360" w:lineRule="auto"/>
+        <w:jc w:val="both"/>
+      </w:pPr>
+    </w:p>
+    <w:p>
+      <w:pPr>
+        <w:spacing w:after="0" w:line="360" w:lineRule="auto"/>
+        <w:jc w:val="both"/>
+      </w:pPr>
+    </w:p>
+    <w:p>
       <w:pPr>
         <w:pStyle w:val="PargrafodaLista"/>
         <w:numPr>
@@ -639,7 +639,7 @@
         <w:t>Do Objeto Do Contrato</w:t>
       </w:r>
     </w:p>
-    <w:p ns2:paraId="1A8651E9" ns2:textId="77777777">
+    <w:p>
       <w:pPr>
         <w:pStyle w:val="PargrafodaLista"/>
         <w:spacing w:after="0" w:line="360" w:lineRule="auto"/>
@@ -654,7 +654,7 @@
         </w:rPr>
       </w:pPr>
     </w:p>
-    <w:p ns2:paraId="28A2C19B" ns2:textId="5D18D12D">
+    <w:p>
       <w:pPr>
         <w:pStyle w:val="PargrafodaLista"/>
         <w:numPr>
@@ -758,7 +758,7 @@
         <w:t>.</w:t>
       </w:r>
     </w:p>
-    <w:p ns2:paraId="28A2C19C" ns2:textId="77777777">
+    <w:p>
       <w:pPr>
         <w:pStyle w:val="PargrafodaLista"/>
         <w:spacing w:after="0" w:line="360" w:lineRule="auto"/>
@@ -771,7 +771,7 @@
         </w:rPr>
       </w:pPr>
     </w:p>
-    <w:p ns2:paraId="28A2C19D" ns2:textId="7052084F">
+    <w:p>
       <w:pPr>
         <w:pStyle w:val="PargrafodaLista"/>
         <w:numPr>
@@ -850,17 +850,17 @@
         <w:t xml:space="preserve"> será responsável pelos seguintes serviços (“Serviços”):</w:t>
       </w:r>
     </w:p>
-    <w:p ns2:paraId="28A2C19E" ns2:textId="77777777">
-      <w:pPr>
-        <w:pStyle w:val="PargrafodaLista"/>
-        <w:rPr>
-          <w:rFonts w:ascii="Times New Roman" w:hAnsi="Times New Roman"/>
-          <w:sz w:val="21"/>
-          <w:szCs w:val="21"/>
-        </w:rPr>
-      </w:pPr>
-    </w:p>
-    <w:p ns2:paraId="28A2C19F" ns2:textId="25DF0D24">
+    <w:p>
+      <w:pPr>
+        <w:pStyle w:val="PargrafodaLista"/>
+        <w:rPr>
+          <w:rFonts w:ascii="Times New Roman" w:hAnsi="Times New Roman"/>
+          <w:sz w:val="21"/>
+          <w:szCs w:val="21"/>
+        </w:rPr>
+      </w:pPr>
+    </w:p>
+    <w:p>
       <w:pPr>
         <w:pStyle w:val="PargrafodaLista"/>
         <w:numPr>
@@ -914,7 +914,7 @@
         <w:t/>
       </w:r>
     </w:p>
-    <w:p ns2:paraId="28A2C1A1" ns2:textId="77777777">
+    <w:p>
       <w:pPr>
         <w:pStyle w:val="PargrafodaLista"/>
         <w:spacing w:after="0" w:line="360" w:lineRule="auto"/>
@@ -927,7 +927,7 @@
         </w:rPr>
       </w:pPr>
     </w:p>
-    <w:p ns2:paraId="28A2C1A2" ns2:textId="77777777">
+    <w:p>
       <w:pPr>
         <w:pStyle w:val="PargrafodaLista"/>
         <w:numPr>
@@ -970,7 +970,7 @@
         <w:t xml:space="preserve"> ou em outro local, a critério das Partes.</w:t>
       </w:r>
     </w:p>
-    <w:p ns2:paraId="6798D6C9" ns2:textId="77777777">
+    <w:p>
       <w:pPr>
         <w:pStyle w:val="PargrafodaLista"/>
         <w:spacing w:after="0" w:line="360" w:lineRule="auto"/>
@@ -983,7 +983,7 @@
         </w:rPr>
       </w:pPr>
     </w:p>
-    <w:p ns2:paraId="29F84CD6" ns2:textId="77777777">
+    <w:p>
       <w:pPr>
         <w:pStyle w:val="PargrafodaLista"/>
         <w:spacing w:after="0" w:line="360" w:lineRule="auto"/>
@@ -996,7 +996,7 @@
         </w:rPr>
       </w:pPr>
     </w:p>
-    <w:p ns2:paraId="28A2C1A4" ns2:textId="77777777">
+    <w:p>
       <w:pPr>
         <w:pStyle w:val="PargrafodaLista"/>
         <w:numPr>
@@ -1025,7 +1025,7 @@
         <w:t>Da Remuneração</w:t>
       </w:r>
     </w:p>
-    <w:p ns2:paraId="5391B3A0" ns2:textId="77777777">
+    <w:p>
       <w:pPr>
         <w:pStyle w:val="PargrafodaLista"/>
         <w:spacing w:after="0" w:line="360" w:lineRule="auto"/>
@@ -1040,7 +1040,7 @@
         </w:rPr>
       </w:pPr>
     </w:p>
-    <w:p ns2:paraId="28A2C1A5" ns2:textId="614D1323">
+    <w:p>
       <w:pPr>
         <w:pStyle w:val="PargrafodaLista"/>
         <w:numPr>
@@ -1132,7 +1132,7 @@
         <w:t>(“Remuneração”).</w:t>
       </w:r>
     </w:p>
-    <w:p ns2:paraId="28A2C1A6" ns2:textId="0C8D330B">
+    <w:p>
       <w:pPr>
         <w:pStyle w:val="PargrafodaLista"/>
         <w:numPr>
@@ -1184,7 +1184,7 @@
         <w:t>.</w:t>
       </w:r>
     </w:p>
-    <w:p ns2:paraId="28A2C1A7" ns2:textId="6BB415A9">
+    <w:p>
       <w:pPr>
         <w:pStyle w:val="PargrafodaLista"/>
         <w:numPr>
@@ -1217,7 +1217,7 @@
         <w:t>.</w:t>
       </w:r>
     </w:p>
-    <w:p ns2:paraId="3712A87C" ns2:textId="77777777">
+    <w:p>
       <w:pPr>
         <w:pStyle w:val="PargrafodaLista"/>
         <w:spacing w:after="0" w:line="360" w:lineRule="auto"/>
@@ -1230,7 +1230,7 @@
         </w:rPr>
       </w:pPr>
     </w:p>
-    <w:p ns2:paraId="292E347B" ns2:textId="77777777">
+    <w:p>
       <w:pPr>
         <w:pStyle w:val="PargrafodaLista"/>
         <w:spacing w:after="0" w:line="360" w:lineRule="auto"/>
@@ -1243,7 +1243,7 @@
         </w:rPr>
       </w:pPr>
     </w:p>
-    <w:p ns2:paraId="28A2C1A9" ns2:textId="77777777">
+    <w:p>
       <w:pPr>
         <w:pStyle w:val="PargrafodaLista"/>
         <w:numPr>
@@ -1272,7 +1272,7 @@
         <w:t>Das Obrigações Da Contratante</w:t>
       </w:r>
     </w:p>
-    <w:p ns2:paraId="06BE39E2" ns2:textId="77777777">
+    <w:p>
       <w:pPr>
         <w:pStyle w:val="PargrafodaLista"/>
         <w:spacing w:after="0" w:line="360" w:lineRule="auto"/>
@@ -1287,7 +1287,7 @@
         </w:rPr>
       </w:pPr>
     </w:p>
-    <w:p ns2:paraId="28A2C1AA" ns2:textId="77777777">
+    <w:p>
       <w:pPr>
         <w:pStyle w:val="PargrafodaLista"/>
         <w:numPr>
@@ -1331,7 +1331,7 @@
         <w:t>se obriga a efetuar o pagamento da Remuneração devida pela prestação dos serviços, conforme definido na Cláusula 2ª acima .</w:t>
       </w:r>
     </w:p>
-    <w:p ns2:paraId="79235096" ns2:textId="77777777">
+    <w:p>
       <w:pPr>
         <w:pStyle w:val="PargrafodaLista"/>
         <w:spacing w:after="0" w:line="360" w:lineRule="auto"/>
@@ -1344,7 +1344,7 @@
         </w:rPr>
       </w:pPr>
     </w:p>
-    <w:p ns2:paraId="0A5DFE34" ns2:textId="77777777">
+    <w:p>
       <w:pPr>
         <w:pStyle w:val="PargrafodaLista"/>
         <w:spacing w:after="0" w:line="360" w:lineRule="auto"/>
@@ -1357,7 +1357,7 @@
         </w:rPr>
       </w:pPr>
     </w:p>
-    <w:p ns2:paraId="28A2C1AC" ns2:textId="77777777">
+    <w:p>
       <w:pPr>
         <w:pStyle w:val="PargrafodaLista"/>
         <w:numPr>
@@ -1386,7 +1386,7 @@
         <w:t>Das Obrigações Da Contratada</w:t>
       </w:r>
     </w:p>
-    <w:p ns2:paraId="42F904BF" ns2:textId="77777777">
+    <w:p>
       <w:pPr>
         <w:pStyle w:val="PargrafodaLista"/>
         <w:spacing w:after="0" w:line="360" w:lineRule="auto"/>
@@ -1401,7 +1401,7 @@
         </w:rPr>
       </w:pPr>
     </w:p>
-    <w:p ns2:paraId="28A2C1AD" ns2:textId="77777777">
+    <w:p>
       <w:pPr>
         <w:pStyle w:val="PargrafodaLista"/>
         <w:numPr>
@@ -1492,7 +1492,7 @@
         <w:t>, sem prejuízo da dignidade e independência profissionais.</w:t>
       </w:r>
     </w:p>
-    <w:p ns2:paraId="28A2C1AE" ns2:textId="77777777">
+    <w:p>
       <w:pPr>
         <w:pStyle w:val="PargrafodaLista"/>
         <w:spacing w:after="0" w:line="360" w:lineRule="auto"/>
@@ -1505,7 +1505,7 @@
         </w:rPr>
       </w:pPr>
     </w:p>
-    <w:p ns2:paraId="28A2C1AF" ns2:textId="77777777">
+    <w:p>
       <w:pPr>
         <w:pStyle w:val="PargrafodaLista"/>
         <w:numPr>
@@ -1557,7 +1557,7 @@
         <w:t>deverá:</w:t>
       </w:r>
     </w:p>
-    <w:p ns2:paraId="28A2C1B0" ns2:textId="77777777">
+    <w:p>
       <w:pPr>
         <w:numPr>
           <w:ilvl w:val="0"/>
@@ -1603,7 +1603,7 @@
         <w:t>, a fim de melhor adequação e ajustes na execução dos Serviços;</w:t>
       </w:r>
     </w:p>
-    <w:p ns2:paraId="28A2C1B1" ns2:textId="77777777">
+    <w:p>
       <w:pPr>
         <w:numPr>
           <w:ilvl w:val="0"/>
@@ -1631,7 +1631,7 @@
         <w:t>Orientar e supervisionar tecnicamente os seus profissionais para a execução dos Serviços;</w:t>
       </w:r>
     </w:p>
-    <w:p ns2:paraId="28A2C1B2" ns2:textId="77777777">
+    <w:p>
       <w:pPr>
         <w:numPr>
           <w:ilvl w:val="0"/>
@@ -1685,7 +1685,7 @@
         <w:t>acompanhe a execução dos Serviços objeto deste Contrato, prestando esclarecimentos sobre o resultado destes, desde que solicitado de forma prévia, expressa e justificada;</w:t>
       </w:r>
     </w:p>
-    <w:p ns2:paraId="28A2C1B3" ns2:textId="77777777">
+    <w:p>
       <w:pPr>
         <w:numPr>
           <w:ilvl w:val="0"/>
@@ -1712,7 +1712,7 @@
         <w:t>Efetuar o pagamento de todos os tributos que sejam de sua competência por força de lei;</w:t>
       </w:r>
     </w:p>
-    <w:p ns2:paraId="28A2C1B4" ns2:textId="77777777">
+    <w:p>
       <w:pPr>
         <w:numPr>
           <w:ilvl w:val="0"/>
@@ -1758,7 +1758,7 @@
         <w:t>, mensalmente, todos os documentos que demonstram o cumprimento de todas as obrigações trabalhistas, previdenciárias e fiscais, dentre as quais, destacam-se (mas não se limitam) (se aplica):</w:t>
       </w:r>
     </w:p>
-    <w:p ns2:paraId="28A2C1B5" ns2:textId="77777777">
+    <w:p>
       <w:pPr>
         <w:numPr>
           <w:ilvl w:val="1"/>
@@ -1785,7 +1785,7 @@
         <w:t>Recolhimento do FGTS – Fundo de Garantia por Tempo de Serviço;</w:t>
       </w:r>
     </w:p>
-    <w:p ns2:paraId="28A2C1B6" ns2:textId="77777777">
+    <w:p>
       <w:pPr>
         <w:numPr>
           <w:ilvl w:val="1"/>
@@ -1812,7 +1812,7 @@
         <w:t>Recolhimento das contribuições e demais tributos devidos ao INSS – Instituto Nacional de Seguridade Social;</w:t>
       </w:r>
     </w:p>
-    <w:p ns2:paraId="28A2C1B7" ns2:textId="77777777">
+    <w:p>
       <w:pPr>
         <w:numPr>
           <w:ilvl w:val="1"/>
@@ -1839,7 +1839,7 @@
         <w:t>Retenção do IRRF – Imposto de Renda Retido na Fonte;</w:t>
       </w:r>
     </w:p>
-    <w:p ns2:paraId="28A2C1B8" ns2:textId="77777777">
+    <w:p>
       <w:pPr>
         <w:numPr>
           <w:ilvl w:val="1"/>
@@ -1866,7 +1866,7 @@
         <w:t>CAGED – Cadastro Geral de Empregados e Desempregados atualizado, incluindo as informações a eventuais admissões e demissões;</w:t>
       </w:r>
     </w:p>
-    <w:p ns2:paraId="28A2C1B9" ns2:textId="77777777">
+    <w:p>
       <w:pPr>
         <w:numPr>
           <w:ilvl w:val="1"/>
@@ -1893,7 +1893,7 @@
         <w:t>Cadastramento para fins do PIS – Programa de Integração Social;</w:t>
       </w:r>
     </w:p>
-    <w:p ns2:paraId="28A2C1BA" ns2:textId="77777777">
+    <w:p>
       <w:pPr>
         <w:numPr>
           <w:ilvl w:val="1"/>
@@ -1920,7 +1920,7 @@
         <w:t>Pagamento das verbas rescisórias dos empregados eventualmente demitidos no período;</w:t>
       </w:r>
     </w:p>
-    <w:p ns2:paraId="28A2C1BB" ns2:textId="77777777">
+    <w:p>
       <w:pPr>
         <w:numPr>
           <w:ilvl w:val="1"/>
@@ -1946,17 +1946,17 @@
         <w:t>Dentre outros.</w:t>
       </w:r>
     </w:p>
-    <w:p ns2:paraId="28A2C1BC" ns2:textId="77777777">
-      <w:pPr>
-        <w:pStyle w:val="PargrafodaLista"/>
-        <w:rPr>
-          <w:rFonts w:ascii="Times New Roman" w:hAnsi="Times New Roman"/>
-          <w:sz w:val="21"/>
-          <w:szCs w:val="21"/>
-        </w:rPr>
-      </w:pPr>
-    </w:p>
-    <w:p ns2:paraId="28A2C1BD" ns2:textId="77777777">
+    <w:p>
+      <w:pPr>
+        <w:pStyle w:val="PargrafodaLista"/>
+        <w:rPr>
+          <w:rFonts w:ascii="Times New Roman" w:hAnsi="Times New Roman"/>
+          <w:sz w:val="21"/>
+          <w:szCs w:val="21"/>
+        </w:rPr>
+      </w:pPr>
+    </w:p>
+    <w:p>
       <w:pPr>
         <w:pStyle w:val="PargrafodaLista"/>
         <w:numPr>
@@ -1999,7 +1999,7 @@
         <w:t xml:space="preserve"> pela prestação dos Serviços está condicionado ao cumprimento, e respectivo envio dos comprovantes, de todas as obrigações inerentes ao exercício de suas atividades econômicas.</w:t>
       </w:r>
     </w:p>
-    <w:p ns2:paraId="28A2C1BE" ns2:textId="77777777">
+    <w:p>
       <w:pPr>
         <w:pStyle w:val="PargrafodaLista"/>
         <w:spacing w:after="0" w:line="360" w:lineRule="auto"/>
@@ -2012,7 +2012,7 @@
         </w:rPr>
       </w:pPr>
     </w:p>
-    <w:p ns2:paraId="28A2C1BF" ns2:textId="77777777">
+    <w:p>
       <w:pPr>
         <w:pStyle w:val="PargrafodaLista"/>
         <w:numPr>
@@ -2064,7 +2064,7 @@
         <w:t>.</w:t>
       </w:r>
     </w:p>
-    <w:p ns2:paraId="28A2C1C0" ns2:textId="77777777">
+    <w:p>
       <w:pPr>
         <w:pStyle w:val="PargrafodaLista"/>
         <w:spacing w:after="0" w:line="360" w:lineRule="auto"/>
@@ -2078,7 +2078,7 @@
       </w:pPr>
     </w:p>
     <w:bookmarkEnd w:id="2"/>
-    <w:p ns2:paraId="28A2C1C1" ns2:textId="77777777">
+    <w:p>
       <w:pPr>
         <w:pStyle w:val="PargrafodaLista"/>
         <w:numPr>
@@ -2185,7 +2185,7 @@
         <w:t>.</w:t>
       </w:r>
     </w:p>
-    <w:p ns2:paraId="28A2C1C2" ns2:textId="77777777">
+    <w:p>
       <w:pPr>
         <w:pStyle w:val="PargrafodaLista"/>
         <w:spacing w:after="0" w:line="360" w:lineRule="auto"/>
@@ -2199,7 +2199,7 @@
         </w:rPr>
       </w:pPr>
     </w:p>
-    <w:p ns2:paraId="28A2C1C4" ns2:textId="07052754">
+    <w:p>
       <w:pPr>
         <w:pStyle w:val="PargrafodaLista"/>
         <w:numPr>
@@ -2260,7 +2260,7 @@
         <w:t xml:space="preserve"> de todos os valores que eventualmente venham a ser por esta despendidos.</w:t>
       </w:r>
     </w:p>
-    <w:p ns2:paraId="1FA173D8" ns2:textId="77777777">
+    <w:p>
       <w:pPr>
         <w:pStyle w:val="PargrafodaLista"/>
         <w:spacing w:after="0" w:line="360" w:lineRule="auto"/>
@@ -2273,7 +2273,7 @@
         </w:rPr>
       </w:pPr>
     </w:p>
-    <w:p ns2:paraId="2F476337" ns2:textId="77777777">
+    <w:p>
       <w:pPr>
         <w:pStyle w:val="PargrafodaLista"/>
         <w:spacing w:after="0" w:line="360" w:lineRule="auto"/>
@@ -2286,7 +2286,7 @@
         </w:rPr>
       </w:pPr>
     </w:p>
-    <w:p ns2:paraId="28A2C1C5" ns2:textId="77777777">
+    <w:p>
       <w:pPr>
         <w:pStyle w:val="PargrafodaLista"/>
         <w:numPr>
@@ -2315,7 +2315,7 @@
         <w:t>Da Vigência</w:t>
       </w:r>
     </w:p>
-    <w:p ns2:paraId="4898B79F" ns2:textId="77777777">
+    <w:p>
       <w:pPr>
         <w:pStyle w:val="PargrafodaLista"/>
         <w:spacing w:after="0" w:line="360" w:lineRule="auto"/>
@@ -2330,7 +2330,7 @@
         </w:rPr>
       </w:pPr>
     </w:p>
-    <w:p ns2:paraId="28A2C1C6" ns2:textId="77777777">
+    <w:p>
       <w:pPr>
         <w:pStyle w:val="PargrafodaLista"/>
         <w:numPr>
@@ -2355,7 +2355,7 @@
         <w:t>O Contrato é celebrado por prazo indeterminado.</w:t>
       </w:r>
     </w:p>
-    <w:p ns2:paraId="28A2C1C7" ns2:textId="77777777">
+    <w:p>
       <w:pPr>
         <w:pStyle w:val="PargrafodaLista"/>
         <w:spacing w:after="0" w:line="360" w:lineRule="auto"/>
@@ -2368,7 +2368,7 @@
         </w:rPr>
       </w:pPr>
     </w:p>
-    <w:p ns2:paraId="28A2C1C8" ns2:textId="77777777">
+    <w:p>
       <w:pPr>
         <w:pStyle w:val="PargrafodaLista"/>
         <w:numPr>
@@ -2393,7 +2393,7 @@
         <w:t>As partes poderão prorrogar este Contrato por igual período, e/ou alterar suas cláusulas e condições, por meio da assinatura de Termo Aditivo.</w:t>
       </w:r>
     </w:p>
-    <w:p ns2:paraId="28A2C1C9" ns2:textId="77777777">
+    <w:p>
       <w:pPr>
         <w:pStyle w:val="PargrafodaLista"/>
         <w:spacing w:after="0" w:line="360" w:lineRule="auto"/>
@@ -2406,7 +2406,7 @@
         </w:rPr>
       </w:pPr>
     </w:p>
-    <w:p ns2:paraId="28A2C1CA" ns2:textId="77777777">
+    <w:p>
       <w:pPr>
         <w:pStyle w:val="PargrafodaLista"/>
         <w:numPr>
@@ -2431,18 +2431,18 @@
         <w:t>As partes poderão resilir unilateralmente o Contrato a qualquer momento, mediante envio de notificação escrita a outra parte com, no mínimo, 30 (trinta) dias de antecedência.</w:t>
       </w:r>
     </w:p>
-    <w:p ns2:paraId="28A2C1CB" ns2:textId="77777777">
-      <w:pPr>
-        <w:pStyle w:val="PargrafodaLista"/>
-        <w:spacing w:after="0" w:line="360" w:lineRule="auto"/>
-        <w:rPr>
-          <w:rFonts w:ascii="Times New Roman" w:hAnsi="Times New Roman"/>
-          <w:sz w:val="21"/>
-          <w:szCs w:val="21"/>
-        </w:rPr>
-      </w:pPr>
-    </w:p>
-    <w:p ns2:paraId="28A2C1CC" ns2:textId="77777777">
+    <w:p>
+      <w:pPr>
+        <w:pStyle w:val="PargrafodaLista"/>
+        <w:spacing w:after="0" w:line="360" w:lineRule="auto"/>
+        <w:rPr>
+          <w:rFonts w:ascii="Times New Roman" w:hAnsi="Times New Roman"/>
+          <w:sz w:val="21"/>
+          <w:szCs w:val="21"/>
+        </w:rPr>
+      </w:pPr>
+    </w:p>
+    <w:p>
       <w:pPr>
         <w:pStyle w:val="PargrafodaLista"/>
         <w:numPr>
@@ -2503,7 +2503,7 @@
         <w:t>.</w:t>
       </w:r>
     </w:p>
-    <w:p ns2:paraId="28A2C1CD" ns2:textId="77777777">
+    <w:p>
       <w:pPr>
         <w:pStyle w:val="PargrafodaLista"/>
         <w:spacing w:after="0" w:line="360" w:lineRule="auto"/>
@@ -2515,7 +2515,7 @@
         </w:rPr>
       </w:pPr>
     </w:p>
-    <w:p ns2:paraId="28A2C1CE" ns2:textId="77777777">
+    <w:p>
       <w:pPr>
         <w:pStyle w:val="PargrafodaLista"/>
         <w:numPr>
@@ -2540,7 +2540,7 @@
         <w:t>As Partes poderão rescindir o presente Contrato, por justo motivo, em casos de:</w:t>
       </w:r>
     </w:p>
-    <w:p ns2:paraId="28A2C1CF" ns2:textId="77777777">
+    <w:p>
       <w:pPr>
         <w:pStyle w:val="PargrafodaLista"/>
         <w:numPr>
@@ -2565,7 +2565,7 @@
         <w:t>Descumprimento reiterado das obrigações dispostas neste Contrato, desde que não sanados e/ou justificados em até 30 (trinta) dias corridos, contados da data de recebimento da notificação escrita que deu conhecimento do fato à Parte Inadimplente; e</w:t>
       </w:r>
     </w:p>
-    <w:p ns2:paraId="28A2C1D0" ns2:textId="77777777">
+    <w:p>
       <w:pPr>
         <w:pStyle w:val="PargrafodaLista"/>
         <w:numPr>
@@ -2590,7 +2590,7 @@
         <w:t>Decretação de falência de quaisquer das partes.</w:t>
       </w:r>
     </w:p>
-    <w:p ns2:paraId="17C2F981" ns2:textId="77777777">
+    <w:p>
       <w:pPr>
         <w:pStyle w:val="PargrafodaLista"/>
         <w:spacing w:after="0" w:line="360" w:lineRule="auto"/>
@@ -2603,7 +2603,7 @@
         </w:rPr>
       </w:pPr>
     </w:p>
-    <w:p ns2:paraId="2217DF07" ns2:textId="77777777">
+    <w:p>
       <w:pPr>
         <w:pStyle w:val="PargrafodaLista"/>
         <w:spacing w:after="0" w:line="360" w:lineRule="auto"/>
@@ -2616,7 +2616,7 @@
         </w:rPr>
       </w:pPr>
     </w:p>
-    <w:p ns2:paraId="28A2C1D2" ns2:textId="77777777">
+    <w:p>
       <w:pPr>
         <w:pStyle w:val="PargrafodaLista"/>
         <w:numPr>
@@ -2645,7 +2645,7 @@
         <w:t>Das Penalidades</w:t>
       </w:r>
     </w:p>
-    <w:p ns2:paraId="41DBA6BC" ns2:textId="77777777">
+    <w:p>
       <w:pPr>
         <w:pStyle w:val="PargrafodaLista"/>
         <w:spacing w:after="0" w:line="360" w:lineRule="auto"/>
@@ -2660,7 +2660,7 @@
         </w:rPr>
       </w:pPr>
     </w:p>
-    <w:p ns2:paraId="28A2C1D3" ns2:textId="77777777">
+    <w:p>
       <w:pPr>
         <w:pStyle w:val="PargrafodaLista"/>
         <w:numPr>
@@ -2685,7 +2685,7 @@
         <w:t>Ocorrendo a inobservância de quaisquer obrigações deste Contrato, a parte que verificar o descumprimento deverá encaminhar uma notificação à parte inadimplente para que esta tome as providências necessárias para sanar a irregularidade.</w:t>
       </w:r>
     </w:p>
-    <w:p ns2:paraId="28A2C1D4" ns2:textId="77777777">
+    <w:p>
       <w:pPr>
         <w:pStyle w:val="PargrafodaLista"/>
         <w:spacing w:after="0" w:line="360" w:lineRule="auto"/>
@@ -2698,7 +2698,7 @@
         </w:rPr>
       </w:pPr>
     </w:p>
-    <w:p ns2:paraId="28A2C1D5" ns2:textId="77777777">
+    <w:p>
       <w:pPr>
         <w:pStyle w:val="PargrafodaLista"/>
         <w:numPr>
@@ -2723,17 +2723,17 @@
         <w:t>Após 5 (cinco) dias do recebimento da notificação, caso a parte inadimplente continue descumprindo com suas obrigações contratuais, será devida multa de 10% (dez por cento) sobre a Remuneração (“Multa por Descumprimento”).</w:t>
       </w:r>
     </w:p>
-    <w:p ns2:paraId="28A2C1D6" ns2:textId="77777777">
-      <w:pPr>
-        <w:pStyle w:val="PargrafodaLista"/>
-        <w:rPr>
-          <w:rFonts w:ascii="Times New Roman" w:hAnsi="Times New Roman"/>
-          <w:sz w:val="21"/>
-          <w:szCs w:val="21"/>
-        </w:rPr>
-      </w:pPr>
-    </w:p>
-    <w:p ns2:paraId="28A2C1D7" ns2:textId="77777777">
+    <w:p>
+      <w:pPr>
+        <w:pStyle w:val="PargrafodaLista"/>
+        <w:rPr>
+          <w:rFonts w:ascii="Times New Roman" w:hAnsi="Times New Roman"/>
+          <w:sz w:val="21"/>
+          <w:szCs w:val="21"/>
+        </w:rPr>
+      </w:pPr>
+    </w:p>
+    <w:p>
       <w:pPr>
         <w:pStyle w:val="PargrafodaLista"/>
         <w:numPr>
@@ -2758,19 +2758,19 @@
         <w:t>A Multa por Descumprimento será dobrada a cada 10 (dez) dias de descumprimento.</w:t>
       </w:r>
     </w:p>
-    <w:p ns2:paraId="28A2C1D8" ns2:textId="77777777">
-      <w:pPr>
-        <w:pStyle w:val="PargrafodaLista"/>
-        <w:spacing w:after="0" w:line="360" w:lineRule="auto"/>
-        <w:jc w:val="both"/>
-        <w:rPr>
-          <w:rFonts w:ascii="Times New Roman" w:hAnsi="Times New Roman"/>
-          <w:sz w:val="21"/>
-          <w:szCs w:val="21"/>
-        </w:rPr>
-      </w:pPr>
-    </w:p>
-    <w:p ns2:paraId="28A2C1D9" ns2:textId="77777777">
+    <w:p>
+      <w:pPr>
+        <w:pStyle w:val="PargrafodaLista"/>
+        <w:spacing w:after="0" w:line="360" w:lineRule="auto"/>
+        <w:jc w:val="both"/>
+        <w:rPr>
+          <w:rFonts w:ascii="Times New Roman" w:hAnsi="Times New Roman"/>
+          <w:sz w:val="21"/>
+          <w:szCs w:val="21"/>
+        </w:rPr>
+      </w:pPr>
+    </w:p>
+    <w:p>
       <w:pPr>
         <w:pStyle w:val="PargrafodaLista"/>
         <w:numPr>
@@ -2814,7 +2814,7 @@
         <w:t xml:space="preserve"> venha a ter acesso no decorrer da prestação de serviços, sem prejuízo da cobrança de perdas e danos, conforme disposição em cláusula própria. </w:t>
       </w:r>
     </w:p>
-    <w:p ns2:paraId="17E5A3A2" ns2:textId="77777777">
+    <w:p>
       <w:pPr>
         <w:pStyle w:val="PargrafodaLista"/>
         <w:spacing w:after="0" w:line="360" w:lineRule="auto"/>
@@ -2826,7 +2826,7 @@
         </w:rPr>
       </w:pPr>
     </w:p>
-    <w:p ns2:paraId="1F2EBC19" ns2:textId="77777777">
+    <w:p>
       <w:pPr>
         <w:pStyle w:val="PargrafodaLista"/>
         <w:spacing w:after="0" w:line="360" w:lineRule="auto"/>
@@ -2838,7 +2838,7 @@
         </w:rPr>
       </w:pPr>
     </w:p>
-    <w:p ns2:paraId="28A2C1DB" ns2:textId="77777777">
+    <w:p>
       <w:pPr>
         <w:pStyle w:val="PargrafodaLista"/>
         <w:numPr>
@@ -2867,7 +2867,7 @@
         <w:t>Confidencialidade Dos Dados e Informações</w:t>
       </w:r>
     </w:p>
-    <w:p ns2:paraId="7C9FE4BE" ns2:textId="77777777">
+    <w:p>
       <w:pPr>
         <w:pStyle w:val="PargrafodaLista"/>
         <w:spacing w:after="0" w:line="360" w:lineRule="auto"/>
@@ -2882,7 +2882,7 @@
         </w:rPr>
       </w:pPr>
     </w:p>
-    <w:p ns2:paraId="28A2C1DC" ns2:textId="77777777">
+    <w:p>
       <w:pPr>
         <w:pStyle w:val="PargrafodaLista"/>
         <w:numPr>
@@ -2961,7 +2961,7 @@
         <w:t>, sinalizados ou não como confidenciais, concordando em:</w:t>
       </w:r>
     </w:p>
-    <w:p ns2:paraId="28A2C1DD" ns2:textId="77777777">
+    <w:p>
       <w:pPr>
         <w:spacing w:after="0" w:line="360" w:lineRule="auto"/>
         <w:contextualSpacing/>
@@ -2973,7 +2973,7 @@
         </w:rPr>
       </w:pPr>
     </w:p>
-    <w:p ns2:paraId="28A2C1DE" ns2:textId="77777777">
+    <w:p>
       <w:pPr>
         <w:pStyle w:val="PargrafodaLista"/>
         <w:numPr>
@@ -2998,7 +2998,7 @@
         <w:t>Manter confidenciais e não divulgar ou revelar nenhuma Informação Confidencial a nenhuma pessoa, exceto aos seus próprios representantes legais, bem como empregados, funcionários e pessoas que estejam vinculadas à execução dos Serviços; e</w:t>
       </w:r>
     </w:p>
-    <w:p ns2:paraId="28A2C1DF" ns2:textId="77777777">
+    <w:p>
       <w:pPr>
         <w:pStyle w:val="PargrafodaLista"/>
         <w:numPr>
@@ -3023,7 +3023,7 @@
         <w:t>Não utilizar as Informações Confidenciais para nenhum propósito que não seja para a consecução dos Serviços.</w:t>
       </w:r>
     </w:p>
-    <w:p ns2:paraId="28A2C1E0" ns2:textId="77777777">
+    <w:p>
       <w:pPr>
         <w:pStyle w:val="PargrafodaLista"/>
         <w:spacing w:after="0" w:line="360" w:lineRule="auto"/>
@@ -3036,7 +3036,7 @@
         </w:rPr>
       </w:pPr>
     </w:p>
-    <w:p ns2:paraId="28A2C1E1" ns2:textId="77777777">
+    <w:p>
       <w:pPr>
         <w:pStyle w:val="PargrafodaLista"/>
         <w:numPr>
@@ -3064,7 +3064,7 @@
         <w:t>A obrigação de confidencialidade permanecerá em pleno vigor e efeito por 10 (dez) anos após o término deste Contrato.</w:t>
       </w:r>
     </w:p>
-    <w:p ns2:paraId="28A2C1E2" ns2:textId="77777777">
+    <w:p>
       <w:pPr>
         <w:pStyle w:val="PargrafodaLista"/>
         <w:spacing w:after="0" w:line="360" w:lineRule="auto"/>
@@ -3078,7 +3078,7 @@
         </w:rPr>
       </w:pPr>
     </w:p>
-    <w:p ns2:paraId="28A2C1E3" ns2:textId="77777777">
+    <w:p>
       <w:pPr>
         <w:pStyle w:val="PargrafodaLista"/>
         <w:numPr>
@@ -3139,17 +3139,17 @@
         <w:t>) devam ser divulgadas por força de lei ou decisão judicial ou administrativa a que a parte esteja sujeita.</w:t>
       </w:r>
     </w:p>
-    <w:p ns2:paraId="28A2C1E4" ns2:textId="77777777">
-      <w:pPr>
-        <w:pStyle w:val="PargrafodaLista"/>
-        <w:rPr>
-          <w:rFonts w:ascii="Times New Roman" w:hAnsi="Times New Roman"/>
-          <w:sz w:val="21"/>
-          <w:szCs w:val="21"/>
-        </w:rPr>
-      </w:pPr>
-    </w:p>
-    <w:p ns2:paraId="28A2C1E5" ns2:textId="77777777">
+    <w:p>
+      <w:pPr>
+        <w:pStyle w:val="PargrafodaLista"/>
+        <w:rPr>
+          <w:rFonts w:ascii="Times New Roman" w:hAnsi="Times New Roman"/>
+          <w:sz w:val="21"/>
+          <w:szCs w:val="21"/>
+        </w:rPr>
+      </w:pPr>
+    </w:p>
+    <w:p>
       <w:pPr>
         <w:pStyle w:val="PargrafodaLista"/>
         <w:numPr>
@@ -3221,27 +3221,27 @@
         <w:t>Contratante.</w:t>
       </w:r>
     </w:p>
-    <w:p ns2:paraId="60E03750" ns2:textId="77777777">
-      <w:pPr>
-        <w:spacing w:after="0" w:line="360" w:lineRule="auto"/>
-        <w:rPr>
-          <w:rFonts w:ascii="Times New Roman" w:hAnsi="Times New Roman"/>
-          <w:sz w:val="21"/>
-          <w:szCs w:val="21"/>
-        </w:rPr>
-      </w:pPr>
-    </w:p>
-    <w:p ns2:paraId="143FDE58" ns2:textId="77777777">
-      <w:pPr>
-        <w:spacing w:after="0" w:line="360" w:lineRule="auto"/>
-        <w:rPr>
-          <w:rFonts w:ascii="Times New Roman" w:hAnsi="Times New Roman"/>
-          <w:sz w:val="21"/>
-          <w:szCs w:val="21"/>
-        </w:rPr>
-      </w:pPr>
-    </w:p>
-    <w:p ns2:paraId="28A2C1E7" ns2:textId="77777777">
+    <w:p>
+      <w:pPr>
+        <w:spacing w:after="0" w:line="360" w:lineRule="auto"/>
+        <w:rPr>
+          <w:rFonts w:ascii="Times New Roman" w:hAnsi="Times New Roman"/>
+          <w:sz w:val="21"/>
+          <w:szCs w:val="21"/>
+        </w:rPr>
+      </w:pPr>
+    </w:p>
+    <w:p>
+      <w:pPr>
+        <w:spacing w:after="0" w:line="360" w:lineRule="auto"/>
+        <w:rPr>
+          <w:rFonts w:ascii="Times New Roman" w:hAnsi="Times New Roman"/>
+          <w:sz w:val="21"/>
+          <w:szCs w:val="21"/>
+        </w:rPr>
+      </w:pPr>
+    </w:p>
+    <w:p>
       <w:pPr>
         <w:pStyle w:val="PargrafodaLista"/>
         <w:numPr>
@@ -3270,7 +3270,7 @@
         <w:t>Da Proteção de Dados</w:t>
       </w:r>
     </w:p>
-    <w:p ns2:paraId="790C3A0D" ns2:textId="77777777">
+    <w:p>
       <w:pPr>
         <w:pStyle w:val="PargrafodaLista"/>
         <w:spacing w:after="0" w:line="360" w:lineRule="auto"/>
@@ -3285,7 +3285,7 @@
         </w:rPr>
       </w:pPr>
     </w:p>
-    <w:p ns2:paraId="28A2C1E8" ns2:textId="77777777">
+    <w:p>
       <w:pPr>
         <w:numPr>
           <w:ilvl w:val="1"/>
@@ -3335,7 +3335,7 @@
         <w:t xml:space="preserve">, por si e por seus colaboradores, obriga-se a atuar no presente Contrato em conformidade com a Legislação vigente sobre Proteção de Dados Pessoais e as determinações de órgãos reguladores/fiscalizadores sobre a matéria, em especial a Lei 13.709/2018, além das demais normas e políticas de proteção de dados aplicáveis. </w:t>
       </w:r>
     </w:p>
-    <w:p ns2:paraId="28A2C1E9" ns2:textId="77777777">
+    <w:p>
       <w:pPr>
         <w:shd w:val="clear" w:color="auto" w:fill="FFFFFF"/>
         <w:spacing w:after="0" w:line="360" w:lineRule="auto"/>
@@ -3350,7 +3350,7 @@
         </w:rPr>
       </w:pPr>
     </w:p>
-    <w:p ns2:paraId="28A2C1EA" ns2:textId="77777777">
+    <w:p>
       <w:pPr>
         <w:numPr>
           <w:ilvl w:val="1"/>
@@ -3410,7 +3410,7 @@
         <w:tab/>
       </w:r>
     </w:p>
-    <w:p ns2:paraId="28A2C1EB" ns2:textId="77777777">
+    <w:p>
       <w:pPr>
         <w:numPr>
           <w:ilvl w:val="0"/>
@@ -3507,7 +3507,7 @@
         <w:t xml:space="preserve"> que terá o direito de rescindir o contrato sem qualquer ônus, multa ou encargo.</w:t>
       </w:r>
     </w:p>
-    <w:p ns2:paraId="28A2C1EC" ns2:textId="77777777">
+    <w:p>
       <w:pPr>
         <w:shd w:val="clear" w:color="auto" w:fill="FFFFFF"/>
         <w:tabs>
@@ -3526,7 +3526,7 @@
         </w:rPr>
       </w:pPr>
     </w:p>
-    <w:p ns2:paraId="28A2C1ED" ns2:textId="77777777">
+    <w:p>
       <w:pPr>
         <w:numPr>
           <w:ilvl w:val="0"/>
@@ -3559,7 +3559,7 @@
         <w:t>Manter e utilizar medidas de segurança administrativas, técnicas e físicas apropriadas e suficientes para proteger a confidencialidade e integridade de todos os dados pessoais mantidos ou consultados/transmitidos eletronicamente, para garantir a proteção desses dados contra acesso não autorizado, destruição, uso, modificação, divulgação e/ou perda acidental ou indevida.</w:t>
       </w:r>
     </w:p>
-    <w:p ns2:paraId="28A2C1EE" ns2:textId="77777777">
+    <w:p>
       <w:pPr>
         <w:shd w:val="clear" w:color="auto" w:fill="FFFFFF"/>
         <w:tabs>
@@ -3577,7 +3577,7 @@
         </w:rPr>
       </w:pPr>
     </w:p>
-    <w:p ns2:paraId="28A2C1EF" ns2:textId="77777777">
+    <w:p>
       <w:pPr>
         <w:numPr>
           <w:ilvl w:val="0"/>
@@ -3632,7 +3632,7 @@
         <w:t>.</w:t>
       </w:r>
     </w:p>
-    <w:p ns2:paraId="28A2C1F0" ns2:textId="77777777">
+    <w:p>
       <w:pPr>
         <w:shd w:val="clear" w:color="auto" w:fill="FFFFFF"/>
         <w:tabs>
@@ -3650,7 +3650,7 @@
         </w:rPr>
       </w:pPr>
     </w:p>
-    <w:p ns2:paraId="28A2C1F1" ns2:textId="77777777">
+    <w:p>
       <w:pPr>
         <w:numPr>
           <w:ilvl w:val="0"/>
@@ -3743,7 +3743,7 @@
         <w:t>. Ainda, treinará e orientará a sua equipe sobre as disposições legais aplicáveis em relação à proteção de dados.</w:t>
       </w:r>
     </w:p>
-    <w:p ns2:paraId="28A2C1F2" ns2:textId="77777777">
+    <w:p>
       <w:pPr>
         <w:shd w:val="clear" w:color="auto" w:fill="FFFFFF"/>
         <w:spacing w:after="0" w:line="360" w:lineRule="auto"/>
@@ -3759,7 +3759,7 @@
         </w:rPr>
       </w:pPr>
     </w:p>
-    <w:p ns2:paraId="28A2C1F3" ns2:textId="77777777">
+    <w:p>
       <w:pPr>
         <w:numPr>
           <w:ilvl w:val="1"/>
@@ -3809,7 +3809,7 @@
         <w:t>, quer direta ou indiretamente, seja mediante a distribuição de cópias, resumos, compilações, extratos, análises, estudos ou outros meios que contenham ou de outra forma reflitam referidas Informações.</w:t>
       </w:r>
     </w:p>
-    <w:p ns2:paraId="28A2C1F4" ns2:textId="77777777">
+    <w:p>
       <w:pPr>
         <w:shd w:val="clear" w:color="auto" w:fill="FFFFFF"/>
         <w:spacing w:after="0" w:line="360" w:lineRule="auto"/>
@@ -3824,7 +3824,7 @@
         </w:rPr>
       </w:pPr>
     </w:p>
-    <w:p ns2:paraId="28A2C1F5" ns2:textId="77777777">
+    <w:p>
       <w:pPr>
         <w:numPr>
           <w:ilvl w:val="1"/>
@@ -3907,7 +3907,7 @@
         <w:t>para que esta tome as medidas que julgar cabíveis.</w:t>
       </w:r>
     </w:p>
-    <w:p ns2:paraId="28A2C1F6" ns2:textId="77777777">
+    <w:p>
       <w:pPr>
         <w:pStyle w:val="PargrafodaLista"/>
         <w:rPr>
@@ -3919,7 +3919,7 @@
         </w:rPr>
       </w:pPr>
     </w:p>
-    <w:p ns2:paraId="28A2C1F7" ns2:textId="77777777">
+    <w:p>
       <w:pPr>
         <w:numPr>
           <w:ilvl w:val="1"/>
@@ -4001,7 +4001,7 @@
         <w:t>em até 24 (vinte e quatro) horas a respeito de:</w:t>
       </w:r>
     </w:p>
-    <w:p ns2:paraId="28A2C1F8" ns2:textId="77777777">
+    <w:p>
       <w:pPr>
         <w:numPr>
           <w:ilvl w:val="0"/>
@@ -4051,7 +4051,7 @@
         <w:t>, seus funcionários, ou terceiros autorizados;</w:t>
       </w:r>
     </w:p>
-    <w:p ns2:paraId="28A2C1F9" ns2:textId="77777777">
+    <w:p>
       <w:pPr>
         <w:numPr>
           <w:ilvl w:val="0"/>
@@ -4113,7 +4113,7 @@
         <w:t xml:space="preserve"> </w:t>
       </w:r>
     </w:p>
-    <w:p ns2:paraId="28A2C1FA" ns2:textId="77777777">
+    <w:p>
       <w:pPr>
         <w:shd w:val="clear" w:color="auto" w:fill="FFFFFF"/>
         <w:spacing w:after="0" w:line="360" w:lineRule="auto"/>
@@ -4128,7 +4128,7 @@
         </w:rPr>
       </w:pPr>
     </w:p>
-    <w:p ns2:paraId="28A2C1FB" ns2:textId="77777777">
+    <w:p>
       <w:pPr>
         <w:numPr>
           <w:ilvl w:val="1"/>
@@ -4242,7 +4242,7 @@
         <w:t>de qualquer das cláusulas previstas neste capítulo quanto a proteção e uso dos dados pessoais.</w:t>
       </w:r>
     </w:p>
-    <w:p ns2:paraId="459F3114" ns2:textId="77777777">
+    <w:p>
       <w:pPr>
         <w:pStyle w:val="PargrafodaLista"/>
         <w:spacing w:after="0" w:line="360" w:lineRule="auto"/>
@@ -4259,7 +4259,7 @@
         </w:rPr>
       </w:pPr>
     </w:p>
-    <w:p ns2:paraId="18CCA07E" ns2:textId="77777777">
+    <w:p>
       <w:pPr>
         <w:pStyle w:val="PargrafodaLista"/>
         <w:spacing w:after="0" w:line="360" w:lineRule="auto"/>
@@ -4276,7 +4276,7 @@
         </w:rPr>
       </w:pPr>
     </w:p>
-    <w:p ns2:paraId="28A2C1FD" ns2:textId="77777777">
+    <w:p>
       <w:pPr>
         <w:pStyle w:val="PargrafodaLista"/>
         <w:numPr>
@@ -4305,7 +4305,7 @@
         <w:t>Dos Direitos de Propriedade Intelectual</w:t>
       </w:r>
     </w:p>
-    <w:p ns2:paraId="419BE071" ns2:textId="77777777">
+    <w:p>
       <w:pPr>
         <w:pStyle w:val="PargrafodaLista"/>
         <w:spacing w:after="0" w:line="360" w:lineRule="auto"/>
@@ -4320,7 +4320,7 @@
         </w:rPr>
       </w:pPr>
     </w:p>
-    <w:p ns2:paraId="28A2C1FE" ns2:textId="77777777">
+    <w:p>
       <w:pPr>
         <w:pStyle w:val="PargrafodaLista"/>
         <w:numPr>
@@ -4367,7 +4367,7 @@
         <w:t>, desenhos, manuais, especificações, diagramas, padronizações e outros documentos de natureza similar e/ou complementar.</w:t>
       </w:r>
     </w:p>
-    <w:p ns2:paraId="28A2C1FF" ns2:textId="77777777">
+    <w:p>
       <w:pPr>
         <w:pStyle w:val="PargrafodaLista"/>
         <w:spacing w:after="0" w:line="360" w:lineRule="auto"/>
@@ -4385,7 +4385,7 @@
       <w:bookmarkStart w:id="3" w:name="_Hlk220512429"/>
       <w:bookmarkEnd w:id="3"/>
     </w:p>
-    <w:p ns2:paraId="28A2C200" ns2:textId="77777777">
+    <w:p>
       <w:pPr>
         <w:pStyle w:val="PargrafodaLista"/>
         <w:numPr>
@@ -4431,7 +4431,7 @@
         <w:t>, cabendo exclusivamente a ela a decisão pelo depósito e manutenção de eventuais resultados patenteáveis ou registráveis nos órgãos competentes.</w:t>
       </w:r>
     </w:p>
-    <w:p ns2:paraId="28A2C201" ns2:textId="77777777">
+    <w:p>
       <w:pPr>
         <w:pStyle w:val="PargrafodaLista"/>
         <w:spacing w:after="0" w:line="360" w:lineRule="auto"/>
@@ -4445,7 +4445,7 @@
         </w:rPr>
       </w:pPr>
     </w:p>
-    <w:p ns2:paraId="28A2C202" ns2:textId="77777777">
+    <w:p>
       <w:pPr>
         <w:pStyle w:val="PargrafodaLista"/>
         <w:numPr>
@@ -4492,7 +4492,7 @@
         <w:t xml:space="preserve"> dos direitos de propriedade intelectual originados em razão da prestação de serviços prevista neste Contrato.</w:t>
       </w:r>
     </w:p>
-    <w:p ns2:paraId="28A2C203" ns2:textId="77777777">
+    <w:p>
       <w:pPr>
         <w:pStyle w:val="PargrafodaLista"/>
         <w:rPr>
@@ -4503,7 +4503,7 @@
         </w:rPr>
       </w:pPr>
     </w:p>
-    <w:p ns2:paraId="28A2C204" ns2:textId="77777777">
+    <w:p>
       <w:pPr>
         <w:pStyle w:val="PargrafodaLista"/>
         <w:numPr>
@@ -4598,7 +4598,7 @@
         <w:t>ainda que originem novos ativos intangíveis.</w:t>
       </w:r>
     </w:p>
-    <w:p ns2:paraId="28A2C205" ns2:textId="77777777">
+    <w:p>
       <w:pPr>
         <w:pStyle w:val="PargrafodaLista"/>
         <w:rPr>
@@ -4609,7 +4609,7 @@
         </w:rPr>
       </w:pPr>
     </w:p>
-    <w:p ns2:paraId="28A2C206" ns2:textId="77777777">
+    <w:p>
       <w:pPr>
         <w:pStyle w:val="PargrafodaLista"/>
         <w:numPr>
@@ -4750,7 +4750,7 @@
         <w:t xml:space="preserve"> obrigada a mantê-los como Informação Confidencial.</w:t>
       </w:r>
     </w:p>
-    <w:p ns2:paraId="1BA87EBF" ns2:textId="77777777">
+    <w:p>
       <w:pPr>
         <w:pStyle w:val="PargrafodaLista"/>
         <w:rPr>
@@ -4761,7 +4761,7 @@
         </w:rPr>
       </w:pPr>
     </w:p>
-    <w:p ns2:paraId="1EBEE01D" ns2:textId="77777777">
+    <w:p>
       <w:pPr>
         <w:pStyle w:val="PargrafodaLista"/>
         <w:spacing w:after="0" w:line="360" w:lineRule="auto"/>
@@ -4775,7 +4775,7 @@
         </w:rPr>
       </w:pPr>
     </w:p>
-    <w:p ns2:paraId="0CA8AF29" ns2:textId="77777777">
+    <w:p>
       <w:pPr>
         <w:pStyle w:val="PargrafodaLista"/>
         <w:spacing w:after="0" w:line="360" w:lineRule="auto"/>
@@ -4791,7 +4791,7 @@
         </w:rPr>
       </w:pPr>
     </w:p>
-    <w:p ns2:paraId="28A2C208" ns2:textId="77777777">
+    <w:p>
       <w:pPr>
         <w:pStyle w:val="PargrafodaLista"/>
         <w:numPr>
@@ -4820,7 +4820,7 @@
         <w:t>Das Políticas Anticorrupção e de Prevenção à Lavagem de Dinheiro</w:t>
       </w:r>
     </w:p>
-    <w:p ns2:paraId="28A2C209" ns2:textId="77777777">
+    <w:p>
       <w:pPr>
         <w:pStyle w:val="PargrafodaLista"/>
         <w:numPr>
@@ -4845,7 +4845,7 @@
         <w:t>As Partes, por si e por seus colaboradores, comprometem-se a relacionarem-se com terceiros que cumpram integralmente suas obrigações legais e mantenham uma postura íntegra, não sendo toleráveis condutas fraudulentas e/ou corruptas.</w:t>
       </w:r>
     </w:p>
-    <w:p ns2:paraId="28A2C20A" ns2:textId="77777777">
+    <w:p>
       <w:pPr>
         <w:pStyle w:val="PargrafodaLista"/>
         <w:spacing w:after="0" w:line="360" w:lineRule="auto"/>
@@ -4858,7 +4858,7 @@
         </w:rPr>
       </w:pPr>
     </w:p>
-    <w:p ns2:paraId="28A2C20B" ns2:textId="77777777">
+    <w:p>
       <w:pPr>
         <w:pStyle w:val="PargrafodaLista"/>
         <w:numPr>
@@ -4902,17 +4902,17 @@
         <w:t>.</w:t>
       </w:r>
     </w:p>
-    <w:p ns2:paraId="28A2C20C" ns2:textId="77777777">
-      <w:pPr>
-        <w:pStyle w:val="PargrafodaLista"/>
-        <w:rPr>
-          <w:rFonts w:ascii="Times New Roman" w:hAnsi="Times New Roman"/>
-          <w:sz w:val="21"/>
-          <w:szCs w:val="21"/>
-        </w:rPr>
-      </w:pPr>
-    </w:p>
-    <w:p ns2:paraId="28A2C20D" ns2:textId="77777777">
+    <w:p>
+      <w:pPr>
+        <w:pStyle w:val="PargrafodaLista"/>
+        <w:rPr>
+          <w:rFonts w:ascii="Times New Roman" w:hAnsi="Times New Roman"/>
+          <w:sz w:val="21"/>
+          <w:szCs w:val="21"/>
+        </w:rPr>
+      </w:pPr>
+    </w:p>
+    <w:p>
       <w:pPr>
         <w:pStyle w:val="PargrafodaLista"/>
         <w:numPr>
@@ -4956,7 +4956,7 @@
         <w:t>.</w:t>
       </w:r>
     </w:p>
-    <w:p ns2:paraId="28A2C20E" ns2:textId="77777777">
+    <w:p>
       <w:pPr>
         <w:pStyle w:val="PargrafodaLista"/>
         <w:spacing w:after="0" w:line="360" w:lineRule="auto"/>
@@ -4969,7 +4969,7 @@
         </w:rPr>
       </w:pPr>
     </w:p>
-    <w:p ns2:paraId="28A2C20F" ns2:textId="77777777">
+    <w:p>
       <w:pPr>
         <w:pStyle w:val="PargrafodaLista"/>
         <w:numPr>
@@ -4994,17 +4994,17 @@
         <w:t>As Partes, declaram e garantem que não estão envolvidas ou irão se envolver, direta ou indiretamente, por meio de seus representantes, administradores, diretores, conselheiros, sócios ou acionistas, assessores, consultores, partes relacionadas, durante o cumprimento das obrigações previstas no Contrato, em qualquer atividade ou prática que constitua uma infração aos termos das leis anticorrupção.</w:t>
       </w:r>
     </w:p>
-    <w:p ns2:paraId="28A2C210" ns2:textId="77777777">
-      <w:pPr>
-        <w:pStyle w:val="PargrafodaLista"/>
-        <w:rPr>
-          <w:rFonts w:ascii="Times New Roman" w:hAnsi="Times New Roman"/>
-          <w:sz w:val="21"/>
-          <w:szCs w:val="21"/>
-        </w:rPr>
-      </w:pPr>
-    </w:p>
-    <w:p ns2:paraId="28A2C211" ns2:textId="77777777">
+    <w:p>
+      <w:pPr>
+        <w:pStyle w:val="PargrafodaLista"/>
+        <w:rPr>
+          <w:rFonts w:ascii="Times New Roman" w:hAnsi="Times New Roman"/>
+          <w:sz w:val="21"/>
+          <w:szCs w:val="21"/>
+        </w:rPr>
+      </w:pPr>
+    </w:p>
+    <w:p>
       <w:pPr>
         <w:pStyle w:val="PargrafodaLista"/>
         <w:numPr>
@@ -5029,7 +5029,7 @@
         <w:t>As Partes se comprometem a não contratar como empregados ou firmar qualquer forma de relacionamento profissional com pessoas físicas ou jurídicas envolvidas em atividades criminosas, em especial pessoas investigadas pelos delitos previstos nas leis anticorrupção e de lavagem de dinheiro.</w:t>
       </w:r>
     </w:p>
-    <w:p ns2:paraId="28A2C212" ns2:textId="77777777">
+    <w:p>
       <w:pPr>
         <w:pStyle w:val="PargrafodaLista"/>
         <w:spacing w:after="0" w:line="360" w:lineRule="auto"/>
@@ -5042,7 +5042,7 @@
         </w:rPr>
       </w:pPr>
     </w:p>
-    <w:p ns2:paraId="28A2C213" ns2:textId="77777777">
+    <w:p>
       <w:pPr>
         <w:pStyle w:val="PargrafodaLista"/>
         <w:numPr>
@@ -5108,19 +5108,19 @@
         <w:t>a respeito de qualquer suspeita ou violação do disposto nas leis anticorrupção e de lavagem de dinheiro, e ainda de participação em práticas de suborno ou corrupção, assim como o descumprimento de qualquer declaração prevista nesta Cláusula.</w:t>
       </w:r>
     </w:p>
-    <w:p ns2:paraId="28A2C214" ns2:textId="77777777">
-      <w:pPr>
-        <w:pStyle w:val="PargrafodaLista"/>
-        <w:rPr>
-          <w:rFonts w:ascii="Times New Roman" w:hAnsi="Times New Roman"/>
-          <w:b/>
-          <w:smallCaps/>
-          <w:sz w:val="21"/>
-          <w:szCs w:val="21"/>
-        </w:rPr>
-      </w:pPr>
-    </w:p>
-    <w:p ns2:paraId="28A2C215" ns2:textId="77777777">
+    <w:p>
+      <w:pPr>
+        <w:pStyle w:val="PargrafodaLista"/>
+        <w:rPr>
+          <w:rFonts w:ascii="Times New Roman" w:hAnsi="Times New Roman"/>
+          <w:b/>
+          <w:smallCaps/>
+          <w:sz w:val="21"/>
+          <w:szCs w:val="21"/>
+        </w:rPr>
+      </w:pPr>
+    </w:p>
+    <w:p>
       <w:pPr>
         <w:pStyle w:val="PargrafodaLista"/>
         <w:numPr>
@@ -5187,19 +5187,19 @@
         <w:t xml:space="preserve"> responsável por eventuais perdas e danos.</w:t>
       </w:r>
     </w:p>
-    <w:p ns2:paraId="28A2C216" ns2:textId="77777777">
-      <w:pPr>
-        <w:pStyle w:val="PargrafodaLista"/>
-        <w:rPr>
-          <w:rFonts w:ascii="Times New Roman" w:hAnsi="Times New Roman"/>
-          <w:b/>
-          <w:smallCaps/>
-          <w:sz w:val="21"/>
-          <w:szCs w:val="21"/>
-        </w:rPr>
-      </w:pPr>
-    </w:p>
-    <w:p ns2:paraId="28A2C217" ns2:textId="77777777">
+    <w:p>
+      <w:pPr>
+        <w:pStyle w:val="PargrafodaLista"/>
+        <w:rPr>
+          <w:rFonts w:ascii="Times New Roman" w:hAnsi="Times New Roman"/>
+          <w:b/>
+          <w:smallCaps/>
+          <w:sz w:val="21"/>
+          <w:szCs w:val="21"/>
+        </w:rPr>
+      </w:pPr>
+    </w:p>
+    <w:p>
       <w:pPr>
         <w:pStyle w:val="PargrafodaLista"/>
         <w:numPr>
@@ -5246,19 +5246,19 @@
         <w:t>declaram, sob as penas da lei, não haver, até a presente data, qualquer impedimento à realização ou mesmo à execução desta Cláusula.</w:t>
       </w:r>
     </w:p>
-    <w:p ns2:paraId="28A2C218" ns2:textId="77777777">
-      <w:pPr>
-        <w:pStyle w:val="PargrafodaLista"/>
-        <w:rPr>
-          <w:rFonts w:ascii="Times New Roman" w:hAnsi="Times New Roman"/>
-          <w:b/>
-          <w:smallCaps/>
-          <w:sz w:val="21"/>
-          <w:szCs w:val="21"/>
-        </w:rPr>
-      </w:pPr>
-    </w:p>
-    <w:p ns2:paraId="4A512E88" ns2:textId="4B535770">
+    <w:p>
+      <w:pPr>
+        <w:pStyle w:val="PargrafodaLista"/>
+        <w:rPr>
+          <w:rFonts w:ascii="Times New Roman" w:hAnsi="Times New Roman"/>
+          <w:b/>
+          <w:smallCaps/>
+          <w:sz w:val="21"/>
+          <w:szCs w:val="21"/>
+        </w:rPr>
+      </w:pPr>
+    </w:p>
+    <w:p>
       <w:pPr>
         <w:pStyle w:val="PargrafodaLista"/>
         <w:numPr>
@@ -5304,7 +5304,7 @@
         <w:t>declaram que não praticaram, não praticam e se obrigam a não praticar quaisquer atos que violem a lei anticorrupção e demais regras correlatas.</w:t>
       </w:r>
     </w:p>
-    <w:p ns2:paraId="12E8410F" ns2:textId="77777777">
+    <w:p>
       <w:pPr>
         <w:pStyle w:val="PargrafodaLista"/>
         <w:rPr>
@@ -5315,7 +5315,7 @@
         </w:rPr>
       </w:pPr>
     </w:p>
-    <w:p ns2:paraId="34B4F845" ns2:textId="77777777">
+    <w:p>
       <w:pPr>
         <w:pStyle w:val="PargrafodaLista"/>
         <w:spacing w:after="0" w:line="360" w:lineRule="auto"/>
@@ -5329,7 +5329,7 @@
         </w:rPr>
       </w:pPr>
     </w:p>
-    <w:p ns2:paraId="28A2C21B" ns2:textId="77777777">
+    <w:p>
       <w:pPr>
         <w:pStyle w:val="PargrafodaLista"/>
         <w:numPr>
@@ -5358,7 +5358,7 @@
         <w:t>Das Disposições Gerais</w:t>
       </w:r>
     </w:p>
-    <w:p ns2:paraId="140329C5" ns2:textId="77777777">
+    <w:p>
       <w:pPr>
         <w:pStyle w:val="PargrafodaLista"/>
         <w:spacing w:after="0" w:line="360" w:lineRule="auto"/>
@@ -5373,7 +5373,7 @@
         </w:rPr>
       </w:pPr>
     </w:p>
-    <w:p ns2:paraId="28A2C21C" ns2:textId="77777777">
+    <w:p>
       <w:pPr>
         <w:pStyle w:val="PargrafodaLista"/>
         <w:numPr>
@@ -5434,19 +5434,19 @@
         <w:t xml:space="preserve"> venha a se utilizar para a execução dos serviços prestados.</w:t>
       </w:r>
     </w:p>
-    <w:p ns2:paraId="28A2C21D" ns2:textId="77777777">
-      <w:pPr>
-        <w:pStyle w:val="PargrafodaLista"/>
-        <w:spacing w:after="0" w:line="360" w:lineRule="auto"/>
-        <w:jc w:val="both"/>
-        <w:rPr>
-          <w:rFonts w:ascii="Times New Roman" w:hAnsi="Times New Roman"/>
-          <w:sz w:val="21"/>
-          <w:szCs w:val="21"/>
-        </w:rPr>
-      </w:pPr>
-    </w:p>
-    <w:p ns2:paraId="28A2C21E" ns2:textId="77777777">
+    <w:p>
+      <w:pPr>
+        <w:pStyle w:val="PargrafodaLista"/>
+        <w:spacing w:after="0" w:line="360" w:lineRule="auto"/>
+        <w:jc w:val="both"/>
+        <w:rPr>
+          <w:rFonts w:ascii="Times New Roman" w:hAnsi="Times New Roman"/>
+          <w:sz w:val="21"/>
+          <w:szCs w:val="21"/>
+        </w:rPr>
+      </w:pPr>
+    </w:p>
+    <w:p>
       <w:pPr>
         <w:pStyle w:val="PargrafodaLista"/>
         <w:numPr>
@@ -5471,7 +5471,7 @@
         <w:t>Nos termos deste Contrato, consideram-se Partes Relacionadas: sócios, administradores, empregados, prepostos ou terceiros contratados e/ou subcontratados para execução do objeto deste Contrato.</w:t>
       </w:r>
     </w:p>
-    <w:p ns2:paraId="28A2C21F" ns2:textId="77777777">
+    <w:p>
       <w:pPr>
         <w:pStyle w:val="PargrafodaLista"/>
         <w:spacing w:after="0" w:line="360" w:lineRule="auto"/>
@@ -5483,7 +5483,7 @@
         </w:rPr>
       </w:pPr>
     </w:p>
-    <w:p ns2:paraId="28A2C220" ns2:textId="77777777">
+    <w:p>
       <w:pPr>
         <w:pStyle w:val="PargrafodaLista"/>
         <w:numPr>
@@ -5544,18 +5544,18 @@
         <w:t xml:space="preserve"> apenas a retenção de tributos que assim sejam determinados pela lei tributária.</w:t>
       </w:r>
     </w:p>
-    <w:p ns2:paraId="28A2C221" ns2:textId="77777777">
-      <w:pPr>
-        <w:pStyle w:val="PargrafodaLista"/>
-        <w:spacing w:after="0" w:line="360" w:lineRule="auto"/>
-        <w:rPr>
-          <w:rFonts w:ascii="Times New Roman" w:hAnsi="Times New Roman"/>
-          <w:sz w:val="21"/>
-          <w:szCs w:val="21"/>
-        </w:rPr>
-      </w:pPr>
-    </w:p>
-    <w:p ns2:paraId="28A2C222" ns2:textId="77777777">
+    <w:p>
+      <w:pPr>
+        <w:pStyle w:val="PargrafodaLista"/>
+        <w:spacing w:after="0" w:line="360" w:lineRule="auto"/>
+        <w:rPr>
+          <w:rFonts w:ascii="Times New Roman" w:hAnsi="Times New Roman"/>
+          <w:sz w:val="21"/>
+          <w:szCs w:val="21"/>
+        </w:rPr>
+      </w:pPr>
+    </w:p>
+    <w:p>
       <w:pPr>
         <w:pStyle w:val="PargrafodaLista"/>
         <w:numPr>
@@ -5616,7 +5616,7 @@
         <w:t>, incluindo sua responsabilidade por todas as despesas e honorários advocatícios despendidos em sua defesa.</w:t>
       </w:r>
     </w:p>
-    <w:p ns2:paraId="28A2C223" ns2:textId="77777777">
+    <w:p>
       <w:pPr>
         <w:pStyle w:val="PargrafodaLista"/>
         <w:spacing w:after="0" w:line="360" w:lineRule="auto"/>
@@ -5629,7 +5629,7 @@
         </w:rPr>
       </w:pPr>
     </w:p>
-    <w:p ns2:paraId="28A2C224" ns2:textId="77777777">
+    <w:p>
       <w:pPr>
         <w:pStyle w:val="PargrafodaLista"/>
         <w:numPr>
@@ -5658,7 +5658,7 @@
         <w:t>As Partes declaram que leram, compreenderam e aceitam todos os termos deste Contrato, que engloba todo o avençado, substituindo toda e qualquer comunicação, declaração ou entendimento anterior, escrito ou verbal.</w:t>
       </w:r>
     </w:p>
-    <w:p ns2:paraId="28A2C225" ns2:textId="77777777">
+    <w:p>
       <w:pPr>
         <w:pStyle w:val="PargrafodaLista"/>
         <w:spacing w:after="0" w:line="360" w:lineRule="auto"/>
@@ -5670,7 +5670,7 @@
         </w:rPr>
       </w:pPr>
     </w:p>
-    <w:p ns2:paraId="28A2C226" ns2:textId="77777777">
+    <w:p>
       <w:pPr>
         <w:pStyle w:val="PargrafodaLista"/>
         <w:numPr>
@@ -5695,7 +5695,7 @@
         <w:t>Todos os avisos, comunicações e solicitações realizados por uma das partes à outra, devem ser dirigidos por escrito por carta com comprovante de recebimento, telegrama, e-mail ou fax aos endereços designados pelas partes como oficiais.</w:t>
       </w:r>
     </w:p>
-    <w:p ns2:paraId="28A2C227" ns2:textId="77777777">
+    <w:p>
       <w:pPr>
         <w:pStyle w:val="PargrafodaLista"/>
         <w:spacing w:after="0" w:line="360" w:lineRule="auto"/>
@@ -5708,7 +5708,7 @@
         </w:rPr>
       </w:pPr>
     </w:p>
-    <w:p ns2:paraId="28A2C228" ns2:textId="77777777">
+    <w:p>
       <w:pPr>
         <w:pStyle w:val="PargrafodaLista"/>
         <w:numPr>
@@ -5733,7 +5733,7 @@
         <w:t>Qualquer alteração dos termos e condições deste Contrato somente será considerada válida se formalizada por escrito em instrumento próprio assinado pelas Partes.</w:t>
       </w:r>
     </w:p>
-    <w:p ns2:paraId="28A2C229" ns2:textId="77777777">
+    <w:p>
       <w:pPr>
         <w:pStyle w:val="PargrafodaLista"/>
         <w:spacing w:after="0" w:line="360" w:lineRule="auto"/>
@@ -5746,7 +5746,7 @@
         </w:rPr>
       </w:pPr>
     </w:p>
-    <w:p ns2:paraId="28A2C22A" ns2:textId="77777777">
+    <w:p>
       <w:pPr>
         <w:pStyle w:val="PargrafodaLista"/>
         <w:numPr>
@@ -5809,7 +5809,7 @@
         <w:t>.</w:t>
       </w:r>
     </w:p>
-    <w:p ns2:paraId="28A2C22B" ns2:textId="77777777">
+    <w:p>
       <w:pPr>
         <w:pStyle w:val="PargrafodaLista"/>
         <w:spacing w:after="0" w:line="360" w:lineRule="auto"/>
@@ -5822,7 +5822,7 @@
         </w:rPr>
       </w:pPr>
     </w:p>
-    <w:p ns2:paraId="28A2C22C" ns2:textId="77777777">
+    <w:p>
       <w:pPr>
         <w:pStyle w:val="PargrafodaLista"/>
         <w:numPr>
@@ -5847,7 +5847,7 @@
         <w:t>A renúncia de qualquer das Partes relativamente ao exercício de qualquer dos direitos atribuídos nos termos deste Contrato ou da legislação aplicável terá efeito somente se manifestada por escrito.</w:t>
       </w:r>
     </w:p>
-    <w:p ns2:paraId="28A2C22D" ns2:textId="77777777">
+    <w:p>
       <w:pPr>
         <w:pStyle w:val="PargrafodaLista"/>
         <w:spacing w:after="0" w:line="360" w:lineRule="auto"/>
@@ -5860,7 +5860,7 @@
         </w:rPr>
       </w:pPr>
     </w:p>
-    <w:p ns2:paraId="28A2C22E" ns2:textId="77777777">
+    <w:p>
       <w:pPr>
         <w:pStyle w:val="PargrafodaLista"/>
         <w:numPr>
@@ -5885,17 +5885,17 @@
         <w:t>Nenhuma tolerância, atraso ou indulgência de qualquer das partes em fazer cumprir qualquer dispositivo deste Contrato prejudicará ou restringirá os direitos de tal parte, nem, tampouco, impedirá tal parte de exercer tais direitos ou quaisquer outros no momento que julgar oportuno, independentemente de comunicações ou notificações prévias.</w:t>
       </w:r>
     </w:p>
-    <w:p ns2:paraId="28A2C22F" ns2:textId="77777777">
-      <w:pPr>
-        <w:pStyle w:val="PargrafodaLista"/>
-        <w:rPr>
-          <w:rFonts w:ascii="Times New Roman" w:hAnsi="Times New Roman"/>
-          <w:sz w:val="21"/>
-          <w:szCs w:val="21"/>
-        </w:rPr>
-      </w:pPr>
-    </w:p>
-    <w:p ns2:paraId="28A2C230" ns2:textId="77777777">
+    <w:p>
+      <w:pPr>
+        <w:pStyle w:val="PargrafodaLista"/>
+        <w:rPr>
+          <w:rFonts w:ascii="Times New Roman" w:hAnsi="Times New Roman"/>
+          <w:sz w:val="21"/>
+          <w:szCs w:val="21"/>
+        </w:rPr>
+      </w:pPr>
+    </w:p>
+    <w:p>
       <w:pPr>
         <w:pStyle w:val="PargrafodaLista"/>
         <w:numPr>
@@ -5920,7 +5920,7 @@
         <w:t>A invalidação ou nulidade, no todo ou em parte, de qualquer das cláusulas ou itens deste Contrato não afetará os demais, que permanecerão sempre válidos e eficazes até o cumprimento de todas as suas obrigações aqui previstas.</w:t>
       </w:r>
     </w:p>
-    <w:p ns2:paraId="28A2C231" ns2:textId="77777777">
+    <w:p>
       <w:pPr>
         <w:pStyle w:val="PargrafodaLista"/>
         <w:spacing w:after="0" w:line="360" w:lineRule="auto"/>
@@ -5933,7 +5933,7 @@
         </w:rPr>
       </w:pPr>
     </w:p>
-    <w:p ns2:paraId="28A2C232" ns2:textId="77777777">
+    <w:p>
       <w:pPr>
         <w:pStyle w:val="PargrafodaLista"/>
         <w:numPr>
@@ -5958,7 +5958,7 @@
         <w:t>Ocorrendo a declaração de invalidade ou nulidade de qualquer cláusula ou item deste Contrato, as Partes, desde já, comprometem-se a negociar, no menor prazo possível, a inclusão de termos e condições válidos que reflitam os termos e condições da cláusula ou item invalidado ou nulo. Neste caso, deverá ser observada a intenção e objetivo das Partes quando da negociação da cláusula ou item invalidado ou nulo e o contexto em que se insere.</w:t>
       </w:r>
     </w:p>
-    <w:p ns2:paraId="28A2C233" ns2:textId="77777777">
+    <w:p>
       <w:pPr>
         <w:pStyle w:val="PargrafodaLista"/>
         <w:spacing w:after="0" w:line="360" w:lineRule="auto"/>
@@ -5970,7 +5970,7 @@
         </w:rPr>
       </w:pPr>
     </w:p>
-    <w:p ns2:paraId="28A2C234" ns2:textId="77777777">
+    <w:p>
       <w:pPr>
         <w:pStyle w:val="PargrafodaLista"/>
         <w:numPr>
@@ -5995,7 +5995,7 @@
         <w:t>Os termos deste Contrato estarão sujeitos à execução específica, conforme disposto no Código de Processo Civil, para o que as Partes reconhecem constituir o presente como título executivo extrajudicial, nos termos do mesmo diploma legal.</w:t>
       </w:r>
     </w:p>
-    <w:p ns2:paraId="02A8CC84" ns2:textId="77777777">
+    <w:p>
       <w:pPr>
         <w:pStyle w:val="PargrafodaLista"/>
         <w:spacing w:after="0" w:line="360" w:lineRule="auto"/>
@@ -6008,7 +6008,7 @@
         </w:rPr>
       </w:pPr>
     </w:p>
-    <w:p ns2:paraId="687AF136" ns2:textId="77777777">
+    <w:p>
       <w:pPr>
         <w:pStyle w:val="PargrafodaLista"/>
         <w:spacing w:after="0" w:line="360" w:lineRule="auto"/>
@@ -6021,7 +6021,7 @@
         </w:rPr>
       </w:pPr>
     </w:p>
-    <w:p ns2:paraId="28A2C236" ns2:textId="77777777">
+    <w:p>
       <w:pPr>
         <w:pStyle w:val="PargrafodaLista"/>
         <w:numPr>
@@ -6054,7 +6054,7 @@
         <w:t>Da Solução de Conflitos e Controvérsias</w:t>
       </w:r>
     </w:p>
-    <w:p ns2:paraId="2E27044D" ns2:textId="77777777">
+    <w:p>
       <w:pPr>
         <w:pStyle w:val="PargrafodaLista"/>
         <w:spacing w:after="0" w:line="360" w:lineRule="auto"/>
@@ -6071,7 +6071,7 @@
         </w:rPr>
       </w:pPr>
     </w:p>
-    <w:p ns2:paraId="28A2C237" ns2:textId="77777777">
+    <w:p>
       <w:pPr>
         <w:numPr>
           <w:ilvl w:val="1"/>
@@ -6095,7 +6095,7 @@
         <w:t>Toda e qualquer discussão ou controvérsia advinda do presente Contrato será inicialmente resolvida de forma amigável, com envio de notificação extrajudicial pela Parte que se sentir prejudicada, concedendo 5 (cinco) dias para solução do problema ou apresentação de justificativas pela outra Parte;</w:t>
       </w:r>
     </w:p>
-    <w:p ns2:paraId="28A2C238" ns2:textId="77777777">
+    <w:p>
       <w:pPr>
         <w:pStyle w:val="PargrafodaLista"/>
         <w:numPr>
@@ -6122,7 +6122,7 @@
         <w:t>Caso não ocorra solução deverá ser procedida a Mediação, sendo que as Partes indicarão um advogado cada, e os 2 (dois) advogados constituídos indicarão um 3º (terceiro) advogado, em comum acordo, cujos custos serão rateados entre as Partes, para que seja o mediador do conflito. Deverá ser realizada reunião presencial com o advogado mediador sugerindo uma forma de solução, exceto na hipótese de uma das Partes declarar, previamente, não possuir interesse na mediação.</w:t>
       </w:r>
     </w:p>
-    <w:p ns2:paraId="28A2C239" ns2:textId="77777777">
+    <w:p>
       <w:pPr>
         <w:pStyle w:val="PargrafodaLista"/>
         <w:spacing w:after="0" w:line="360" w:lineRule="auto"/>
@@ -6136,7 +6136,7 @@
         </w:rPr>
       </w:pPr>
     </w:p>
-    <w:p ns2:paraId="28A2C23A" ns2:textId="77777777">
+    <w:p>
       <w:pPr>
         <w:numPr>
           <w:ilvl w:val="1"/>
@@ -6160,7 +6160,7 @@
         <w:t>Caso o litígio persista, originário deste Contrato ou de qualquer modo a ele relacionado, inclusive quanto a sua interpretação, validade, ou aplicação, e que não seja resolvido por consenso, será dirimido da seguinte forma:</w:t>
       </w:r>
     </w:p>
-    <w:p ns2:paraId="28A2C23B" ns2:textId="77777777">
+    <w:p>
       <w:pPr>
         <w:numPr>
           <w:ilvl w:val="2"/>
@@ -6183,7 +6183,7 @@
         <w:t>Judicialmente – se envolver valores de até R$ 50.000,00 (cinquenta mil reais). Sendo o foro Central da Comarca da Capital do Estado de São Paulo o eleito para dirimir quaisquer controvérsias do presente Contrato, por mais privilegiado que outras possam ser;</w:t>
       </w:r>
     </w:p>
-    <w:p ns2:paraId="28A2C23C" ns2:textId="77777777">
+    <w:p>
       <w:pPr>
         <w:numPr>
           <w:ilvl w:val="2"/>
@@ -6206,7 +6206,7 @@
         <w:t>Por Arbitragem – quando envolver valores superiores. Ficando definida na forma do disposto nesta Cláusula, do Regulamento da Câmara de Conciliação, Mediação e Arbitragem da FIESP e da Lei nº. 9.307/96, salvo se a via judicial for aplicável, conforme definido abaixo, valendo a presente como Cláusula Compromissória, nos termos do artigo 4º da Lei nº 9.307/96.</w:t>
       </w:r>
     </w:p>
-    <w:p ns2:paraId="28A2C23D" ns2:textId="77777777">
+    <w:p>
       <w:pPr>
         <w:numPr>
           <w:ilvl w:val="1"/>
@@ -6230,7 +6230,7 @@
         <w:t>A arbitragem será efetuada por um tribunal constituído de acordo com a presente Cláusula e, adicionalmente, em conformidade com o estabelecido no Regulamento da Câmara de Conciliação, Mediação e Arbitragem da FIESP em vigor no momento da arbitragem.</w:t>
       </w:r>
     </w:p>
-    <w:p ns2:paraId="23C41961" ns2:textId="15EEB654">
+    <w:p>
       <w:pPr>
         <w:numPr>
           <w:ilvl w:val="1"/>
@@ -6254,7 +6254,7 @@
         <w:t>Assinatura das Partes referente ao aceite do compromisso arbitral:</w:t>
       </w:r>
     </w:p>
-    <w:p ns2:paraId="72795326" ns2:textId="77777777">
+    <w:p>
       <w:pPr>
         <w:spacing w:line="360" w:lineRule="auto"/>
         <w:jc w:val="both"/>
@@ -6265,7 +6265,7 @@
         </w:rPr>
       </w:pPr>
     </w:p>
-    <w:p ns2:paraId="28A2C240" ns2:textId="77777777">
+    <w:p>
       <w:pPr>
         <w:spacing w:line="360" w:lineRule="auto"/>
         <w:ind w:left="708"/>
@@ -6285,7 +6285,7 @@
         <w:t>__________________________________________________________________________</w:t>
       </w:r>
     </w:p>
-    <w:p ns2:paraId="28A2C241" ns2:textId="40B81031">
+    <w:p>
       <w:pPr>
         <w:spacing w:line="360" w:lineRule="auto"/>
         <w:ind w:left="708"/>
@@ -6317,7 +6317,7 @@
         <w:t/>
       </w:r>
     </w:p>
-    <w:p ns2:paraId="28A2C242" ns2:textId="77777777">
+    <w:p>
       <w:pPr>
         <w:spacing w:line="360" w:lineRule="auto"/>
         <w:ind w:left="708"/>
@@ -6330,7 +6330,7 @@
         </w:rPr>
       </w:pPr>
     </w:p>
-    <w:p ns2:paraId="28A2C243" ns2:textId="77777777">
+    <w:p>
       <w:pPr>
         <w:spacing w:line="360" w:lineRule="auto"/>
         <w:ind w:left="708"/>
@@ -6351,7 +6351,7 @@
         <w:t>__________________________________________________________________________</w:t>
       </w:r>
     </w:p>
-    <w:p ns2:paraId="28A2C245" ns2:textId="37BA223D">
+    <w:p>
       <w:pPr>
         <w:spacing w:line="360" w:lineRule="auto"/>
         <w:ind w:left="708"/>
@@ -6373,7 +6373,7 @@
         <w:t>Scient Consultoria de Gestão Empresarial Ltda.</w:t>
       </w:r>
     </w:p>
-    <w:p ns2:paraId="28A2C246" ns2:textId="77777777">
+    <w:p>
       <w:pPr>
         <w:pStyle w:val="PargrafodaLista"/>
         <w:numPr>
@@ -6410,7 +6410,7 @@
         <w:t>sendo 01 (um) designado por cada Parte em litígio e o terceiro, que presidirá o Tribunal Arbitral, designado por acordo entre os 02 (dois) árbitros, no período máximo de 15 (quinze) dias contados da data em que designado o segundo árbitro. Se houver mais de 1 (um) requerente ou mais de 1 (um) requerido, os requerentes ou requeridos devem indicar em conjunto 1 (um) árbitro. Toda e qualquer controvérsia ou omissão relativa à indicação dos árbitros, bem como à escolha do terceiro árbitro, será dirimida ou suprida pela Câmara de Comércio Brasil-Canadá, nos termos de seu Regulamento.</w:t>
       </w:r>
     </w:p>
-    <w:p ns2:paraId="28A2C247" ns2:textId="77777777">
+    <w:p>
       <w:pPr>
         <w:pStyle w:val="PargrafodaLista"/>
         <w:spacing w:after="0" w:line="360" w:lineRule="auto"/>
@@ -6425,7 +6425,7 @@
         </w:rPr>
       </w:pPr>
     </w:p>
-    <w:p ns2:paraId="28A2C248" ns2:textId="77777777">
+    <w:p>
       <w:pPr>
         <w:numPr>
           <w:ilvl w:val="1"/>
@@ -6478,7 +6478,7 @@
         <w:t>, uma vez formado o Tribunal Arbitral.</w:t>
       </w:r>
     </w:p>
-    <w:p ns2:paraId="28A2C249" ns2:textId="77777777">
+    <w:p>
       <w:pPr>
         <w:numPr>
           <w:ilvl w:val="1"/>
@@ -6502,7 +6502,7 @@
         <w:t>A arbitragem terá sede na Cidade de São Paulo – Estado de São Paulo, e será conduzida em português, no local escolhido pelo árbitro presidente. A lei aplicável ao mérito da arbitragem será a brasileira, e os árbitros não poderão decidir por equidade. O tribunal arbitral poderá conceder as tutelas urgentes e definitivas que entender apropriadas, inclusive voltadas ao cumprimento específico das obrigações previstas neste Contrato.</w:t>
       </w:r>
     </w:p>
-    <w:p ns2:paraId="28A2C24A" ns2:textId="77777777">
+    <w:p>
       <w:pPr>
         <w:numPr>
           <w:ilvl w:val="1"/>
@@ -6526,7 +6526,7 @@
         <w:t>A sentença arbitral conterá, além do objeto da disputa, uma condenação no pagamento de custas, a serem calculadas com base na sucumbência das Partes em litígio e incluirá igualmente, além dos custos referentes ao processo e ao pagamento do Tribunal Arbitral, um montante destinado a suportar os custos com a arbitragem, que incluirão os honorários dos respectivos advogados e as despesas administrativas indicadas pelos mesmos e relacionadas com o processo arbitral.</w:t>
       </w:r>
     </w:p>
-    <w:p ns2:paraId="28A2C24B" ns2:textId="77777777">
+    <w:p>
       <w:pPr>
         <w:numPr>
           <w:ilvl w:val="1"/>
@@ -6550,7 +6550,7 @@
         <w:t>A sentença arbitral proferida pelo Tribunal Arbitral será considerada final e definitiva, e obrigará as Partes e seus sucessores, que renunciam expressamente a qualquer recurso. Não obstante, as Partes reservam-se o direito de recorrer ao Poder Judiciário com o objetivo exclusivo de: (a) assegurar a instituição da arbitragem; (b) obter tutelas cautelares ou antecipadas previamente à instituição da arbitragem, sendo que qualquer procedimento nesse sentido não será considerado como ato de renúncia à arbitragem como único meio de solução de conflitos escolhido pelas Partes; e/ou (c) executar qualquer decisão do tribunal arbitral, inclusive o laudo arbitral bem como executar as obrigações previstas neste Contrato.</w:t>
       </w:r>
     </w:p>
-    <w:p ns2:paraId="20343414" ns2:textId="3B84FA70">
+    <w:p>
       <w:pPr>
         <w:numPr>
           <w:ilvl w:val="1"/>
@@ -6574,7 +6574,7 @@
         <w:t>Todo e qualquer procedimento arbitral a ser instaurado deverá tramitar em sigilo de forma a proteger os interesses das Partes.</w:t>
       </w:r>
     </w:p>
-    <w:p ns2:paraId="28A2C24E" ns2:textId="77777777">
+    <w:p>
       <w:pPr>
         <w:pStyle w:val="PargrafodaLista"/>
         <w:numPr>
@@ -6608,7 +6608,7 @@
         <w:t>Do Foro</w:t>
       </w:r>
     </w:p>
-    <w:p ns2:paraId="18A1C0D6" ns2:textId="77777777">
+    <w:p>
       <w:pPr>
         <w:pStyle w:val="PargrafodaLista"/>
         <w:spacing w:after="0" w:line="360" w:lineRule="auto"/>
@@ -6625,7 +6625,7 @@
         </w:rPr>
       </w:pPr>
     </w:p>
-    <w:p ns2:paraId="28A2C250" ns2:textId="38F7C5C6">
+    <w:p>
       <w:pPr>
         <w:numPr>
           <w:ilvl w:val="1"/>
@@ -6649,7 +6649,7 @@
         <w:t>As partes elegem a Comarca de São Paulo/SP, para dirimir quaisquer dúvidas ou controvérsias que surgirem, decorrentes da execução deste Contrato, que não estejam contempladas pela cláusula compromissória acima.</w:t>
       </w:r>
     </w:p>
-    <w:p ns2:paraId="28A2C251" ns2:textId="77777777">
+    <w:p>
       <w:pPr>
         <w:spacing w:after="0" w:line="360" w:lineRule="auto"/>
         <w:contextualSpacing/>
@@ -6681,7 +6681,7 @@
         <w:t>em 2 (duas) vias de igual teor e forma, na presença de 2 (duas) testemunhas infra-assinadas e qualificadas.</w:t>
       </w:r>
     </w:p>
-    <w:p ns2:paraId="28A2C252" ns2:textId="77777777">
+    <w:p>
       <w:pPr>
         <w:spacing w:after="0" w:line="360" w:lineRule="auto"/>
         <w:contextualSpacing/>
@@ -6693,7 +6693,7 @@
         </w:rPr>
       </w:pPr>
     </w:p>
-    <w:p ns2:paraId="46259A9B" ns2:textId="29CDF78C">
+    <w:p>
       <w:pPr>
         <w:spacing w:after="0" w:line="360" w:lineRule="auto"/>
         <w:contextualSpacing/>
@@ -6741,14 +6741,14 @@
         <w:t>.</w:t>
       </w:r>
     </w:p>
-    <w:p ns2:paraId="24C5512E" ns2:textId="77777777">
+    <w:p>
       <w:pPr>
         <w:spacing w:after="0" w:line="360" w:lineRule="auto"/>
         <w:contextualSpacing/>
         <w:jc w:val="center"/>
       </w:pPr>
     </w:p>
-    <w:p ns2:paraId="28A2C255" ns2:textId="77777777">
+    <w:p>
       <w:pPr>
         <w:spacing w:after="0" w:line="360" w:lineRule="auto"/>
         <w:contextualSpacing/>
@@ -6760,7 +6760,7 @@
         </w:rPr>
       </w:pPr>
     </w:p>
-    <w:p ns2:paraId="33D41155" ns2:textId="77777777">
+    <w:p>
       <w:pPr>
         <w:pStyle w:val="PargrafodaLista"/>
         <w:spacing w:after="0" w:line="360" w:lineRule="auto"/>
@@ -6785,7 +6785,7 @@
         <w:t xml:space="preserve">{{Razão social}}  </w:t>
       </w:r>
     </w:p>
-    <w:p ns2:paraId="6B905E59" ns2:textId="77777777">
+    <w:p>
       <w:pPr>
         <w:pStyle w:val="PargrafodaLista"/>
         <w:spacing w:after="0" w:line="360" w:lineRule="auto"/>
@@ -6800,7 +6800,7 @@
         </w:rPr>
       </w:pPr>
     </w:p>
-    <w:p ns2:paraId="07B22B78" ns2:textId="77777777">
+    <w:p>
       <w:pPr>
         <w:pStyle w:val="PargrafodaLista"/>
         <w:spacing w:after="0" w:line="360" w:lineRule="auto"/>
@@ -6815,7 +6815,7 @@
         </w:rPr>
       </w:pPr>
     </w:p>
-    <w:p ns2:paraId="28A2C257" ns2:textId="58B2E924">
+    <w:p>
       <w:pPr>
         <w:pStyle w:val="PargrafodaLista"/>
         <w:spacing w:after="0" w:line="360" w:lineRule="auto"/>
@@ -6838,7 +6838,7 @@
         <w:t>Scient Consultoria de Gestão Empresarial Ltda.</w:t>
       </w:r>
     </w:p>
-    <w:p ns2:paraId="0AAC5957" ns2:textId="77777777">
+    <w:p>
       <w:pPr>
         <w:spacing w:after="0" w:line="360" w:lineRule="auto"/>
         <w:contextualSpacing/>
@@ -6850,7 +6850,7 @@
         </w:rPr>
       </w:pPr>
     </w:p>
-    <w:p ns2:paraId="28A2C258" ns2:textId="77777777">
+    <w:p>
       <w:pPr>
         <w:spacing w:after="0" w:line="360" w:lineRule="auto"/>
         <w:contextualSpacing/>
@@ -6870,7 +6870,7 @@
         <w:t>Testemunhas:</w:t>
       </w:r>
     </w:p>
-    <w:p ns2:paraId="28A2C259" ns2:textId="77777777">
+    <w:p>
       <w:pPr>
         <w:spacing w:after="0" w:line="360" w:lineRule="auto"/>
         <w:contextualSpacing/>
@@ -6882,7 +6882,7 @@
         </w:rPr>
       </w:pPr>
     </w:p>
-    <w:p ns2:paraId="28A2C25A" ns2:textId="77777777">
+    <w:p>
       <w:pPr>
         <w:spacing w:after="0" w:line="360" w:lineRule="auto"/>
         <w:jc w:val="both"/>
@@ -6921,7 +6921,7 @@
         <w:t>2.____________________________</w:t>
       </w:r>
     </w:p>
-    <w:p ns2:paraId="28A2C25B" ns2:textId="77777777">
+    <w:p>
       <w:pPr>
         <w:spacing w:after="0" w:line="360" w:lineRule="auto"/>
         <w:jc w:val="both"/>
@@ -6992,7 +6992,7 @@
         <w:t>Nome:</w:t>
       </w:r>
     </w:p>
-    <w:p ns2:paraId="28A2C25C" ns2:textId="77777777">
+    <w:p>
       <w:pPr>
         <w:tabs>
           <w:tab w:val="left" w:pos="4891"/>
@@ -7031,7 +7031,7 @@
         <w:t>CPF:</w:t>
       </w:r>
     </w:p>
-    <w:p ns2:paraId="28A2C25D" ns2:textId="77777777">
+    <w:p>
       <w:pPr>
         <w:tabs>
           <w:tab w:val="left" w:pos="4891"/>
@@ -7070,7 +7070,7 @@
         <w:t>RG:</w:t>
       </w:r>
     </w:p>
-    <w:p ns2:paraId="28A2C25E" ns2:textId="77777777">
+    <w:p>
       <w:pPr>
         <w:tabs>
           <w:tab w:val="left" w:pos="4891"/>
@@ -7084,7 +7084,7 @@
         </w:rPr>
       </w:pPr>
     </w:p>
-    <w:p ns2:paraId="28A2C25F" ns2:textId="77777777">
+    <w:p>
       <w:pPr>
         <w:tabs>
           <w:tab w:val="left" w:pos="4891"/>
@@ -7098,7 +7098,7 @@
         </w:rPr>
       </w:pPr>
     </w:p>
-    <w:p ns2:paraId="28A2C260" ns2:textId="77777777">
+    <w:p>
       <w:pPr>
         <w:tabs>
           <w:tab w:val="left" w:pos="4891"/>
@@ -7113,7 +7113,7 @@
       </w:pPr>
     </w:p>
     <w:sectPr>
-      <w:footerReference w:type="default" ns3:id="rId10"/>
+      <w:footerReference w:type="default" r:id="rId10"/>
       <w:pgSz w:w="11906" w:h="16838"/>
       <w:pgMar w:top="1989" w:right="1701" w:bottom="1417" w:left="1701" w:header="0" w:footer="310" w:gutter="0"/>
       <w:cols w:space="720"/>

</xml_diff>

<commit_message>
contratos-time v0.3.0: preserva formatação (salva .docx sem converter)
- A conversão para Google Doc nativo desformatava (Calibri->Arial, título,
  espaçamento). Agora salva como .docx no Drive (disableConversionToGoogleType=true),
  que abre editável no Google Docs em modo Office com formatação idêntica
- Normaliza fontes padrão dos templates: docDefaults e estilo Normal (eram
  Liberation Serif / Calibri) -> Times New Roman
- Comando, agente e config atualizados

Co-Authored-By: Claude Opus 4.8 <noreply@anthropic.com>
Claude-Session: https://claude.ai/code/session_01HrnpzzFeHRtBe1dRWCL3oW
</commit_message>
<xml_diff>
--- a/contratos-time/templates/freelancer.docx
+++ b/contratos-time/templates/freelancer.docx
@@ -8060,11 +8060,11 @@
 </file>
 
 <file path=word/styles.xml><?xml version="1.0" encoding="utf-8"?>
-<w:styles xmlns:mc="http://schemas.openxmlformats.org/markup-compatibility/2006" xmlns:r="http://schemas.openxmlformats.org/officeDocument/2006/relationships" xmlns:w="http://schemas.openxmlformats.org/wordprocessingml/2006/main" xmlns:w14="http://schemas.microsoft.com/office/word/2010/wordml" xmlns:w15="http://schemas.microsoft.com/office/word/2012/wordml" xmlns:w16cex="http://schemas.microsoft.com/office/word/2018/wordml/cex" xmlns:w16cid="http://schemas.microsoft.com/office/word/2016/wordml/cid" xmlns:w16="http://schemas.microsoft.com/office/word/2018/wordml" xmlns:w16du="http://schemas.microsoft.com/office/word/2023/wordml/word16du" xmlns:w16sdtdh="http://schemas.microsoft.com/office/word/2020/wordml/sdtdatahash" xmlns:w16sdtfl="http://schemas.microsoft.com/office/word/2024/wordml/sdtformatlock" xmlns:w16se="http://schemas.microsoft.com/office/word/2015/wordml/symex" mc:Ignorable="w14 w15 w16se w16cid w16 w16cex w16sdtdh w16sdtfl w16du">
+<w:styles xmlns:r="http://schemas.openxmlformats.org/officeDocument/2006/relationships" xmlns:w14="http://schemas.microsoft.com/office/word/2010/wordml" xmlns:w15="http://schemas.microsoft.com/office/word/2012/wordml" xmlns:w16cex="http://schemas.microsoft.com/office/word/2018/wordml/cex" xmlns:w16cid="http://schemas.microsoft.com/office/word/2016/wordml/cid" xmlns:w16="http://schemas.microsoft.com/office/word/2018/wordml" xmlns:w16du="http://schemas.microsoft.com/office/word/2023/wordml/word16du" xmlns:w16sdtdh="http://schemas.microsoft.com/office/word/2020/wordml/sdtdatahash" xmlns:w16sdtfl="http://schemas.microsoft.com/office/word/2024/wordml/sdtformatlock" xmlns:w16se="http://schemas.microsoft.com/office/word/2015/wordml/symex" xmlns:mc="http://schemas.openxmlformats.org/markup-compatibility/2006" xmlns:w="http://schemas.openxmlformats.org/wordprocessingml/2006/main" mc:Ignorable="w14 w15 w16se w16cid w16 w16cex w16sdtdh w16sdtfl w16du">
   <w:docDefaults>
     <w:rPrDefault>
       <w:rPr>
-        <w:rFonts w:ascii="Liberation Serif" w:eastAsia="DejaVu Sans" w:hAnsi="Liberation Serif" w:cs="DejaVu Sans"/>
+        <w:rFonts w:ascii="Times New Roman" w:eastAsia="DejaVu Sans" w:hAnsi="Times New Roman" w:cs="DejaVu Sans"/>
         <w:sz w:val="24"/>
         <w:szCs w:val="24"/>
         <w:lang w:val="en-US" w:eastAsia="zh-CN" w:bidi="hi-IN"/>
@@ -8461,7 +8461,7 @@
       <w:spacing w:after="160" w:line="257" w:lineRule="auto"/>
     </w:pPr>
     <w:rPr>
-      <w:rFonts w:ascii="Calibri" w:eastAsia="Calibri" w:hAnsi="Calibri" w:cs="Times New Roman"/>
+      <w:rFonts w:ascii="Times New Roman" w:eastAsia="Times New Roman" w:hAnsi="Times New Roman" w:cs="Times New Roman"/>
       <w:sz w:val="22"/>
       <w:szCs w:val="22"/>
       <w:lang w:val="pt-BR" w:bidi="ar-SA"/>
@@ -8750,14 +8750,14 @@
     <w:name w:val="Cabeçalho Char"/>
     <w:qFormat/>
     <w:rPr>
-      <w:rFonts w:ascii="Calibri" w:eastAsia="Calibri" w:hAnsi="Calibri" w:cs="Times New Roman"/>
+      <w:rFonts w:ascii="Times New Roman" w:eastAsia="Times New Roman" w:hAnsi="Times New Roman" w:cs="Times New Roman"/>
     </w:rPr>
   </w:style>
   <w:style w:type="character" w:customStyle="1" w:styleId="RodapChar">
     <w:name w:val="Rodapé Char"/>
     <w:qFormat/>
     <w:rPr>
-      <w:rFonts w:ascii="Calibri" w:eastAsia="Calibri" w:hAnsi="Calibri" w:cs="Times New Roman"/>
+      <w:rFonts w:ascii="Times New Roman" w:eastAsia="Times New Roman" w:hAnsi="Times New Roman" w:cs="Times New Roman"/>
     </w:rPr>
   </w:style>
   <w:style w:type="character" w:styleId="Hyperlink">
@@ -8771,7 +8771,7 @@
     <w:name w:val="Texto de balão Char"/>
     <w:qFormat/>
     <w:rPr>
-      <w:rFonts w:ascii="Segoe UI" w:hAnsi="Segoe UI" w:cs="Segoe UI"/>
+      <w:rFonts w:ascii="Times New Roman" w:hAnsi="Times New Roman" w:cs="Times New Roman"/>
       <w:sz w:val="18"/>
       <w:szCs w:val="18"/>
     </w:rPr>
@@ -8919,7 +8919,7 @@
       <w:spacing w:after="0" w:line="240" w:lineRule="auto"/>
     </w:pPr>
     <w:rPr>
-      <w:rFonts w:ascii="Segoe UI" w:hAnsi="Segoe UI" w:cs="Segoe UI"/>
+      <w:rFonts w:ascii="Times New Roman" w:hAnsi="Times New Roman" w:cs="Times New Roman"/>
       <w:sz w:val="18"/>
       <w:szCs w:val="18"/>
     </w:rPr>
@@ -8973,7 +8973,7 @@
     <w:name w:val="Revision"/>
     <w:qFormat/>
     <w:rPr>
-      <w:rFonts w:ascii="Calibri" w:eastAsia="Calibri" w:hAnsi="Calibri" w:cs="Times New Roman"/>
+      <w:rFonts w:ascii="Times New Roman" w:eastAsia="Times New Roman" w:hAnsi="Times New Roman" w:cs="Times New Roman"/>
       <w:sz w:val="22"/>
       <w:szCs w:val="22"/>
       <w:lang w:val="pt-BR" w:bidi="ar-SA"/>

</xml_diff>

<commit_message>
contratos-time v0.4.4: testemunha da SCIENT (Matheus) fixa nos templates
Preenche a testemunha 1 (lado SCIENT) com Matheus Abraão Pinheiro Ferreira
(CPF 125.217.057-21) nos templates full_time (2 blocos) e freelancer, deixando a
testemunha 2 em branco. Mesma regra já aplicada no contratos-clientes.

Co-Authored-By: Claude Opus 4.8 <noreply@anthropic.com>
Claude-Session: https://claude.ai/code/session_01HrnpzzFeHRtBe1dRWCL3oW
</commit_message>
<xml_diff>
--- a/contratos-time/templates/freelancer.docx
+++ b/contratos-time/templates/freelancer.docx
@@ -6932,7 +6932,7 @@
           <w:sz w:val="21"/>
           <w:szCs w:val="21"/>
         </w:rPr>
-        <w:t xml:space="preserve">Nome: </w:t>
+        <w:t xml:space="preserve">Nome: Matheus Abraão Pinheiro FerreiraNome:</w:t>
       </w:r>
       <w:r>
         <w:rPr>
@@ -6989,7 +6989,7 @@
           <w:szCs w:val="21"/>
         </w:rPr>
         <w:tab/>
-        <w:t>Nome:</w:t>
+        <w:t/>
       </w:r>
     </w:p>
     <w:p>
@@ -7011,7 +7011,7 @@
           <w:sz w:val="21"/>
           <w:szCs w:val="21"/>
         </w:rPr>
-        <w:t xml:space="preserve">CPF: </w:t>
+        <w:t xml:space="preserve">CPF: 125.217.057-21CPF:</w:t>
       </w:r>
       <w:r>
         <w:rPr>
@@ -7028,7 +7028,7 @@
           <w:szCs w:val="21"/>
         </w:rPr>
         <w:tab/>
-        <w:t>CPF:</w:t>
+        <w:t/>
       </w:r>
     </w:p>
     <w:p>

</xml_diff>